<commit_message>
cleanup + refined GC
</commit_message>
<xml_diff>
--- a/Docs/Do_Stable_Coins_Predict_Cryptos.docx
+++ b/Docs/Do_Stable_Coins_Predict_Cryptos.docx
@@ -4,61 +4,43 @@
   <w:body>
     <w:p>
       <w:pPr>
-        <w:rPr>
-          <w:b/>
-          <w:bCs/>
-          <w:u w:val="single"/>
-        </w:rPr>
-      </w:pPr>
-      <w:r>
-        <w:rPr>
-          <w:b/>
-          <w:bCs/>
-          <w:u w:val="single"/>
-        </w:rPr>
-        <w:t>Do Stable</w:t>
-      </w:r>
-      <w:r>
-        <w:rPr>
-          <w:b/>
-          <w:bCs/>
-          <w:u w:val="single"/>
-        </w:rPr>
-        <w:t>c</w:t>
-      </w:r>
-      <w:r>
-        <w:rPr>
-          <w:b/>
-          <w:bCs/>
-          <w:u w:val="single"/>
-        </w:rPr>
-        <w:t>oins Predict Cryptos? A Copula-based approach</w:t>
-      </w:r>
-    </w:p>
-    <w:p>
-      <w:pPr>
-        <w:rPr>
-          <w:b/>
-          <w:bCs/>
-        </w:rPr>
-      </w:pPr>
-      <w:r>
-        <w:rPr>
-          <w:b/>
-          <w:bCs/>
-        </w:rPr>
+        <w:pStyle w:val="Title"/>
+      </w:pPr>
+      <w:r>
+        <w:t>The Relationship Between Cryptos and Stablecoins</w:t>
+      </w:r>
+      <w:r>
+        <w:t xml:space="preserve">? </w:t>
+      </w:r>
+    </w:p>
+    <w:p>
+      <w:pPr>
+        <w:pStyle w:val="Heading1"/>
+      </w:pPr>
+      <w:r>
+        <w:t xml:space="preserve">1 </w:t>
+      </w:r>
+      <w:r>
         <w:t>Overview</w:t>
       </w:r>
     </w:p>
     <w:p>
       <w:r>
-        <w:t>We used 5 years of daily stablecoin and crypto data (2020-2024) to assess if stablecoins carry predictive power for major crypto</w:t>
-      </w:r>
-      <w:r>
-        <w:t xml:space="preserve"> market dynamics</w:t>
-      </w:r>
-      <w:r>
-        <w:t>.</w:t>
+        <w:t xml:space="preserve">We used 5 years of daily stablecoin and crypto data (2020-2024) to assess </w:t>
+      </w:r>
+      <w:r>
+        <w:t>the relationship between cryptos and stablecoins</w:t>
+      </w:r>
+    </w:p>
+    <w:p>
+      <w:pPr>
+        <w:pStyle w:val="Heading2"/>
+      </w:pPr>
+      <w:r>
+        <w:t xml:space="preserve">1.1 </w:t>
+      </w:r>
+      <w:r>
+        <w:t>Metrics</w:t>
       </w:r>
     </w:p>
     <w:p>
@@ -74,8 +56,8 @@
       </w:tblPr>
       <w:tblGrid>
         <w:gridCol w:w="3005"/>
-        <w:gridCol w:w="3005"/>
-        <w:gridCol w:w="3006"/>
+        <w:gridCol w:w="2235"/>
+        <w:gridCol w:w="3776"/>
       </w:tblGrid>
       <w:tr>
         <w:tc>
@@ -100,7 +82,7 @@
         </w:tc>
         <w:tc>
           <w:tcPr>
-            <w:tcW w:w="3005" w:type="dxa"/>
+            <w:tcW w:w="2235" w:type="dxa"/>
           </w:tcPr>
           <w:p>
             <w:pPr>
@@ -120,7 +102,7 @@
         </w:tc>
         <w:tc>
           <w:tcPr>
-            <w:tcW w:w="3006" w:type="dxa"/>
+            <w:tcW w:w="3776" w:type="dxa"/>
           </w:tcPr>
           <w:p>
             <w:pPr>
@@ -152,7 +134,7 @@
         </w:tc>
         <w:tc>
           <w:tcPr>
-            <w:tcW w:w="3005" w:type="dxa"/>
+            <w:tcW w:w="2235" w:type="dxa"/>
           </w:tcPr>
           <w:p>
             <w:pPr>
@@ -203,7 +185,7 @@
         </w:tc>
         <w:tc>
           <w:tcPr>
-            <w:tcW w:w="3006" w:type="dxa"/>
+            <w:tcW w:w="3776" w:type="dxa"/>
           </w:tcPr>
           <w:p/>
           <w:p>
@@ -215,7 +197,10 @@
               </w:numPr>
             </w:pPr>
             <w:r>
-              <w:t>Delta Log RV</w:t>
+              <w:t xml:space="preserve">Delta Log </w:t>
+            </w:r>
+            <w:r>
+              <w:t>Garman-Klass</w:t>
             </w:r>
           </w:p>
           <w:p>
@@ -245,7 +230,7 @@
         </w:tc>
         <w:tc>
           <w:tcPr>
-            <w:tcW w:w="3005" w:type="dxa"/>
+            <w:tcW w:w="2235" w:type="dxa"/>
           </w:tcPr>
           <w:p>
             <w:pPr>
@@ -303,7 +288,7 @@
         </w:tc>
         <w:tc>
           <w:tcPr>
-            <w:tcW w:w="3006" w:type="dxa"/>
+            <w:tcW w:w="3776" w:type="dxa"/>
           </w:tcPr>
           <w:p/>
           <w:p>
@@ -315,7 +300,10 @@
               </w:numPr>
             </w:pPr>
             <w:r>
-              <w:t>Delta Log RV</w:t>
+              <w:t xml:space="preserve">Delta Log </w:t>
+            </w:r>
+            <w:r>
+              <w:t>Garman-Klass</w:t>
             </w:r>
           </w:p>
           <w:p>
@@ -336,12 +324,48 @@
     <w:p/>
     <w:p>
       <w:r>
-        <w:t>The first thing to consider is how we determine which stablecoin metrics have predictive power for which crypto metrics</w:t>
-      </w:r>
-    </w:p>
-    <w:p>
-      <w:r>
-        <w:t>The naive approach, that many papers seem to use, is to test every stablecoin/crypto metric pair individually. For example, with 3 stablecoins, 2 stablecoin metrics, 4 cryptos, and 2 crypto metrics, we would have to run 48 individual tests. This creates two issues:</w:t>
+        <w:t xml:space="preserve">Our volume and returns </w:t>
+      </w:r>
+      <w:r>
+        <w:t>metrics are common choices so require no justification. We choose Garman-Klass volatility as it gives us the best ‘</w:t>
+      </w:r>
+      <w:r>
+        <w:t>pointwise</w:t>
+      </w:r>
+      <w:r>
+        <w:t xml:space="preserve">’ volatility for a given day by </w:t>
+      </w:r>
+      <w:r>
+        <w:t>considering</w:t>
+      </w:r>
+      <w:r>
+        <w:t xml:space="preserve"> the high, low, open and close prices for that day. </w:t>
+      </w:r>
+      <w:r>
+        <w:t>Realised Volatility (RV) is a common choice but is usually calculated using a rolling window</w:t>
+      </w:r>
+      <w:r>
+        <w:t xml:space="preserve"> on intra-day data. Unfortunately, we do not have this data and so opt for Garman-Klass. Moreover, we could calculate a rolling window RV using our daily </w:t>
+      </w:r>
+      <w:r>
+        <w:t>data,</w:t>
+      </w:r>
+      <w:r>
+        <w:t xml:space="preserve"> but this will give us a very smoothed picture of volatility and will not capture</w:t>
+      </w:r>
+      <w:r>
+        <w:t xml:space="preserve"> and react well to</w:t>
+      </w:r>
+      <w:r>
+        <w:t xml:space="preserve"> instances of high </w:t>
+      </w:r>
+      <w:r>
+        <w:t>volatility.</w:t>
+      </w:r>
+    </w:p>
+    <w:p>
+      <w:r>
+        <w:t>We test the predictive power of Stablecoins and Cryptos in both directions:</w:t>
       </w:r>
     </w:p>
     <w:p>
@@ -353,16 +377,7 @@
         </w:numPr>
       </w:pPr>
       <w:r>
-        <w:t xml:space="preserve">Stablecoin metrics are highly correlated with </w:t>
-      </w:r>
-      <w:r>
-        <w:t>each other,</w:t>
-      </w:r>
-      <w:r>
-        <w:t xml:space="preserve"> and crypto metrics are highly correlated with each other. </w:t>
-      </w:r>
-      <w:r>
-        <w:t>For example, seeing if USDT volatility predicts BTC returns is an extremely similar test to seeing if USDC volatility predicts BTC returns. Most of the 48 tests would essentially be repeats and give us no new information</w:t>
+        <w:t>Stablecoin predicts crypto</w:t>
       </w:r>
     </w:p>
     <w:p>
@@ -374,6 +389,72 @@
         </w:numPr>
       </w:pPr>
       <w:r>
+        <w:t>Crypto predicts Stablecoin</w:t>
+      </w:r>
+    </w:p>
+    <w:p>
+      <w:r>
+        <w:t>We do this to capture their relationship, how they move with one another, and any cyclical structure in the market.</w:t>
+      </w:r>
+    </w:p>
+    <w:p>
+      <w:pPr>
+        <w:pStyle w:val="Heading2"/>
+      </w:pPr>
+      <w:r>
+        <w:lastRenderedPageBreak/>
+        <w:t xml:space="preserve">1.2 </w:t>
+      </w:r>
+      <w:proofErr w:type="gramStart"/>
+      <w:r>
+        <w:t>Principle</w:t>
+      </w:r>
+      <w:proofErr w:type="gramEnd"/>
+      <w:r>
+        <w:t xml:space="preserve"> Component Analysis (PCA)</w:t>
+      </w:r>
+    </w:p>
+    <w:p>
+      <w:r>
+        <w:t>The naive approach, that many papers seem to use, is to test every stablecoin/crypto metric pair individually. For example, with 3 stablecoins, 2 stablecoin metrics, 4 cryptos, and 2 crypto metrics, we would have to run 48 individual tests</w:t>
+      </w:r>
+      <w:r>
+        <w:t xml:space="preserve"> in each direction</w:t>
+      </w:r>
+      <w:r>
+        <w:t>. This creates two issues:</w:t>
+      </w:r>
+    </w:p>
+    <w:p>
+      <w:pPr>
+        <w:pStyle w:val="ListParagraph"/>
+        <w:numPr>
+          <w:ilvl w:val="0"/>
+          <w:numId w:val="1"/>
+        </w:numPr>
+      </w:pPr>
+      <w:r>
+        <w:t xml:space="preserve">Stablecoin metrics are highly correlated with </w:t>
+      </w:r>
+      <w:r>
+        <w:t>each other,</w:t>
+      </w:r>
+      <w:r>
+        <w:t xml:space="preserve"> and crypto metrics are highly correlated with each other. </w:t>
+      </w:r>
+      <w:r>
+        <w:t>For example, seeing if USDT volatility predicts BTC returns is an extremely similar test to seeing if USDC volatility predicts BTC returns. Most of the 48 tests would essentially be repeats and give us no new information</w:t>
+      </w:r>
+    </w:p>
+    <w:p>
+      <w:pPr>
+        <w:pStyle w:val="ListParagraph"/>
+        <w:numPr>
+          <w:ilvl w:val="0"/>
+          <w:numId w:val="1"/>
+        </w:numPr>
+      </w:pPr>
+      <w:r>
         <w:t xml:space="preserve">With 48 tests at significant level 0.05, we are guaranteed to fine false positives </w:t>
       </w:r>
     </w:p>
@@ -497,7 +578,6 @@
     </w:p>
     <w:p>
       <w:r>
-        <w:lastRenderedPageBreak/>
         <w:t>This means we now</w:t>
       </w:r>
       <w:r>
@@ -510,7 +590,13 @@
         <w:t xml:space="preserve"> </w:t>
       </w:r>
       <w:r>
-        <w:t>perform 4 tests:</w:t>
+        <w:t xml:space="preserve">perform </w:t>
+      </w:r>
+      <w:r>
+        <w:t>8</w:t>
+      </w:r>
+      <w:r>
+        <w:t xml:space="preserve"> tests:</w:t>
       </w:r>
     </w:p>
     <w:p>
@@ -549,10 +635,7 @@
         </w:numPr>
       </w:pPr>
       <w:r>
-        <w:t xml:space="preserve">Stablecoin Volume -&gt; Crypto </w:t>
-      </w:r>
-      <w:r>
-        <w:t>Returns</w:t>
+        <w:t>Stablecoin Volume -&gt; Crypto Returns</w:t>
       </w:r>
     </w:p>
     <w:p>
@@ -564,10 +647,12 @@
         </w:numPr>
       </w:pPr>
       <w:r>
-        <w:t xml:space="preserve">Stablecoin Volatility -&gt; Crypto </w:t>
-      </w:r>
-      <w:r>
-        <w:t>Returns</w:t>
+        <w:t>Stablecoin Volatility -&gt; Crypto Returns</w:t>
+      </w:r>
+    </w:p>
+    <w:p>
+      <w:r>
+        <w:t>(The other 4 tests are the reverse of the above)</w:t>
       </w:r>
     </w:p>
     <w:p>
@@ -587,7 +672,15 @@
         <w:t xml:space="preserve">The </w:t>
       </w:r>
       <w:r>
-        <w:t>systemic signal that affects the market as a whole (Captured by PCA)</w:t>
+        <w:t xml:space="preserve">systemic signal that affects the </w:t>
+      </w:r>
+      <w:proofErr w:type="gramStart"/>
+      <w:r>
+        <w:t>market as a whole</w:t>
+      </w:r>
+      <w:proofErr w:type="gramEnd"/>
+      <w:r>
+        <w:t xml:space="preserve"> (Captured by PCA)</w:t>
       </w:r>
     </w:p>
     <w:p>
@@ -650,6 +743,7 @@
         <w:t xml:space="preserve"> </w:t>
       </w:r>
       <w:r>
+        <w:lastRenderedPageBreak/>
         <w:t xml:space="preserve">PCA also offers interpretability by allowing us to examine the </w:t>
       </w:r>
       <w:r>
@@ -664,37 +758,210 @@
       </w:r>
     </w:p>
     <w:p>
-      <w:pPr>
+      <w:r>
+        <w:t xml:space="preserve">In practice, we use </w:t>
+      </w:r>
+      <w:r>
         <w:rPr>
           <w:b/>
           <w:bCs/>
         </w:rPr>
-      </w:pPr>
+        <w:t>Expanding Window PCA</w:t>
+      </w:r>
+      <w:r>
+        <w:t xml:space="preserve"> to prevent data leakage.</w:t>
+      </w:r>
+      <w:r>
+        <w:t xml:space="preserve"> In a</w:t>
+      </w:r>
+      <w:r>
+        <w:t>n OOS</w:t>
+      </w:r>
+      <w:r>
+        <w:t xml:space="preserve"> </w:t>
+      </w:r>
+      <w:r>
+        <w:t>back test</w:t>
+      </w:r>
+      <w:r>
+        <w:t>, we recalculate the PCA after every day to include the new day.</w:t>
+      </w:r>
+    </w:p>
+    <w:p>
+      <w:r>
+        <w:t xml:space="preserve">When performing PCA, we must select which </w:t>
+      </w:r>
+      <w:proofErr w:type="gramStart"/>
+      <w:r>
+        <w:t>principle</w:t>
+      </w:r>
+      <w:proofErr w:type="gramEnd"/>
+      <w:r>
+        <w:t xml:space="preserve"> components to use. </w:t>
+      </w:r>
+      <w:r>
+        <w:t xml:space="preserve">To help us select which </w:t>
+      </w:r>
+      <w:proofErr w:type="gramStart"/>
+      <w:r>
+        <w:t>Principle</w:t>
+      </w:r>
+      <w:proofErr w:type="gramEnd"/>
+      <w:r>
+        <w:t xml:space="preserve"> Components to use, we employ Horn’s analysis which </w:t>
+      </w:r>
+      <w:r>
+        <w:t xml:space="preserve">analyses which </w:t>
+      </w:r>
+      <w:proofErr w:type="gramStart"/>
+      <w:r>
+        <w:t>principle</w:t>
+      </w:r>
+      <w:proofErr w:type="gramEnd"/>
+      <w:r>
+        <w:t xml:space="preserve"> components are statistically distinguishable </w:t>
+      </w:r>
+      <w:proofErr w:type="spellStart"/>
+      <w:r>
+        <w:t>form</w:t>
+      </w:r>
+      <w:proofErr w:type="spellEnd"/>
+      <w:r>
+        <w:t xml:space="preserve"> random noise. We find that every one of our PCA </w:t>
+      </w:r>
+      <w:r>
+        <w:t xml:space="preserve">results only has the first </w:t>
+      </w:r>
+      <w:proofErr w:type="gramStart"/>
+      <w:r>
+        <w:t>principle</w:t>
+      </w:r>
+      <w:proofErr w:type="gramEnd"/>
+      <w:r>
+        <w:t xml:space="preserve"> component as statistically significant.</w:t>
+      </w:r>
+    </w:p>
+    <w:p>
+      <w:r>
+        <w:t>For example</w:t>
+      </w:r>
+      <w:r>
+        <w:t xml:space="preserve">, the </w:t>
+      </w:r>
+      <w:proofErr w:type="gramStart"/>
+      <w:r>
+        <w:t>principle</w:t>
+      </w:r>
+      <w:proofErr w:type="gramEnd"/>
+      <w:r>
+        <w:t xml:space="preserve"> components of crypto volatility</w:t>
+      </w:r>
+      <w:r>
+        <w:t>:</w:t>
+      </w:r>
+    </w:p>
+    <w:p>
+      <w:pPr>
+        <w:jc w:val="center"/>
+      </w:pPr>
+      <w:r>
+        <w:rPr>
+          <w:noProof/>
+        </w:rPr>
+        <w:drawing>
+          <wp:inline distT="0" distB="0" distL="0" distR="0" wp14:anchorId="0DB816F5" wp14:editId="628411BA">
+            <wp:extent cx="4801870" cy="2853671"/>
+            <wp:effectExtent l="0" t="0" r="0" b="4445"/>
+            <wp:docPr id="1174373265" name="Picture 1" descr="A graph with a line and a red line&#10;&#10;AI-generated content may be incorrect."/>
+            <wp:cNvGraphicFramePr>
+              <a:graphicFrameLocks xmlns:a="http://schemas.openxmlformats.org/drawingml/2006/main" noChangeAspect="1"/>
+            </wp:cNvGraphicFramePr>
+            <a:graphic xmlns:a="http://schemas.openxmlformats.org/drawingml/2006/main">
+              <a:graphicData uri="http://schemas.openxmlformats.org/drawingml/2006/picture">
+                <pic:pic xmlns:pic="http://schemas.openxmlformats.org/drawingml/2006/picture">
+                  <pic:nvPicPr>
+                    <pic:cNvPr id="1174373265" name="Picture 1" descr="A graph with a line and a red line&#10;&#10;AI-generated content may be incorrect."/>
+                    <pic:cNvPicPr/>
+                  </pic:nvPicPr>
+                  <pic:blipFill>
+                    <a:blip r:embed="rId5"/>
+                    <a:stretch>
+                      <a:fillRect/>
+                    </a:stretch>
+                  </pic:blipFill>
+                  <pic:spPr>
+                    <a:xfrm>
+                      <a:off x="0" y="0"/>
+                      <a:ext cx="4815503" cy="2861773"/>
+                    </a:xfrm>
+                    <a:prstGeom prst="rect">
+                      <a:avLst/>
+                    </a:prstGeom>
+                  </pic:spPr>
+                </pic:pic>
+              </a:graphicData>
+            </a:graphic>
+          </wp:inline>
+        </w:drawing>
+      </w:r>
+    </w:p>
+    <w:p>
+      <w:pPr>
+        <w:pStyle w:val="Heading2"/>
+      </w:pPr>
+      <w:r>
+        <w:t xml:space="preserve">1.3 </w:t>
+      </w:r>
+      <w:r>
+        <w:t>Winsorisa</w:t>
+      </w:r>
+      <w:r>
+        <w:t>tion</w:t>
+      </w:r>
+    </w:p>
+    <w:p>
+      <w:r>
+        <w:t xml:space="preserve">We also use </w:t>
+      </w:r>
       <w:r>
         <w:rPr>
           <w:b/>
           <w:bCs/>
         </w:rPr>
-        <w:t>Methodology</w:t>
-      </w:r>
-    </w:p>
-    <w:p>
-      <w:r>
-        <w:t xml:space="preserve">First, we test for stationarity in each of our </w:t>
-      </w:r>
-      <w:r>
-        <w:t xml:space="preserve">time series. We do this before </w:t>
-      </w:r>
-      <w:r>
-        <w:t>PCA</w:t>
-      </w:r>
-      <w:r>
-        <w:t xml:space="preserve"> as otherwise the generated PC1 series would tell us very little.</w:t>
-      </w:r>
-    </w:p>
-    <w:p>
-      <w:r>
-        <w:t>We conduct 3 main tests:</w:t>
+        <w:t>Winsorisation</w:t>
+      </w:r>
+      <w:r>
+        <w:t xml:space="preserve"> to mitigate the effects of extreme outliers in crypto markets.</w:t>
+      </w:r>
+      <w:r>
+        <w:t xml:space="preserve"> Winsorisation is the idea of capping extreme outliers at a given quantile. In this research, we winsorise at the 0.01 and 0.99 quantiles, which is common practice. This means a</w:t>
+      </w:r>
+      <w:r>
+        <w:t xml:space="preserve">ny value outside of the 0.01 </w:t>
+      </w:r>
+      <w:r>
+        <w:t xml:space="preserve">and 0.99 </w:t>
+      </w:r>
+      <w:r>
+        <w:t>quantile</w:t>
+      </w:r>
+      <w:r>
+        <w:t>s</w:t>
+      </w:r>
+      <w:r>
+        <w:t xml:space="preserve"> will be set to the value at the 0.01 </w:t>
+      </w:r>
+      <w:r>
+        <w:t>and 0.99 quantiles respectively</w:t>
+      </w:r>
+      <w:r>
+        <w:t>.</w:t>
+      </w:r>
+      <w:r>
+        <w:t xml:space="preserve"> This prevents black swan events from </w:t>
+      </w:r>
+      <w:r>
+        <w:t>skewing our models. These events include:</w:t>
       </w:r>
     </w:p>
     <w:p>
@@ -706,7 +973,7 @@
         </w:numPr>
       </w:pPr>
       <w:r>
-        <w:t>Copula Granger Causality (In Sample)</w:t>
+        <w:t>Terra Luna Collapse</w:t>
       </w:r>
     </w:p>
     <w:p>
@@ -718,23 +985,7 @@
         </w:numPr>
       </w:pPr>
       <w:r>
-        <w:t xml:space="preserve">Copula – GARCH forecasting (OOS, </w:t>
-      </w:r>
-      <w:proofErr w:type="spellStart"/>
-      <w:r>
-        <w:t>LogLikelihood</w:t>
-      </w:r>
-      <w:proofErr w:type="spellEnd"/>
-      <w:r>
-        <w:t xml:space="preserve"> and </w:t>
-      </w:r>
-      <w:proofErr w:type="spellStart"/>
-      <w:r>
-        <w:t>VaR</w:t>
-      </w:r>
-      <w:proofErr w:type="spellEnd"/>
-      <w:r>
-        <w:t>)</w:t>
+        <w:t>FTX Collapse</w:t>
       </w:r>
     </w:p>
     <w:p>
@@ -746,6 +997,726 @@
         </w:numPr>
       </w:pPr>
       <w:r>
+        <w:t>There are others but cannot remember right now</w:t>
+      </w:r>
+    </w:p>
+    <w:p>
+      <w:r>
+        <w:t xml:space="preserve">These huge outliers are normally caused my macro event where there </w:t>
+      </w:r>
+      <w:proofErr w:type="gramStart"/>
+      <w:r>
+        <w:t>are is</w:t>
+      </w:r>
+      <w:proofErr w:type="gramEnd"/>
+      <w:r>
+        <w:t xml:space="preserve"> no way of predicting them from </w:t>
+      </w:r>
+      <w:r>
+        <w:t>time series data alone</w:t>
+      </w:r>
+    </w:p>
+    <w:p>
+      <w:pPr>
+        <w:pStyle w:val="Heading1"/>
+      </w:pPr>
+      <w:r>
+        <w:lastRenderedPageBreak/>
+        <w:t xml:space="preserve">2 </w:t>
+      </w:r>
+      <w:r>
+        <w:t>Methodolog</w:t>
+      </w:r>
+      <w:r>
+        <w:t>y</w:t>
+      </w:r>
+    </w:p>
+    <w:p>
+      <w:r>
+        <w:t>In this section, we discuss the tests we run and models we construct to capture the relationship between Stablecoins and Cryptos</w:t>
+      </w:r>
+      <w:r>
+        <w:t>. We are asking the following questions:</w:t>
+      </w:r>
+    </w:p>
+    <w:p>
+      <w:pPr>
+        <w:pStyle w:val="ListParagraph"/>
+        <w:numPr>
+          <w:ilvl w:val="0"/>
+          <w:numId w:val="7"/>
+        </w:numPr>
+      </w:pPr>
+      <w:r>
+        <w:t>Does a relationship exist?</w:t>
+      </w:r>
+    </w:p>
+    <w:p>
+      <w:pPr>
+        <w:pStyle w:val="ListParagraph"/>
+        <w:numPr>
+          <w:ilvl w:val="0"/>
+          <w:numId w:val="7"/>
+        </w:numPr>
+      </w:pPr>
+      <w:r>
+        <w:t>What is the horizon of the relationship (Daily, Weekly, Monthly)</w:t>
+      </w:r>
+    </w:p>
+    <w:p>
+      <w:pPr>
+        <w:pStyle w:val="ListParagraph"/>
+        <w:numPr>
+          <w:ilvl w:val="0"/>
+          <w:numId w:val="7"/>
+        </w:numPr>
+      </w:pPr>
+      <w:r>
+        <w:t>S</w:t>
+      </w:r>
+      <w:r>
+        <w:t>oes the relationship change with regimes</w:t>
+      </w:r>
+      <w:r>
+        <w:t>/time</w:t>
+      </w:r>
+      <w:r>
+        <w:t>?</w:t>
+      </w:r>
+    </w:p>
+    <w:p>
+      <w:pPr>
+        <w:pStyle w:val="ListParagraph"/>
+        <w:numPr>
+          <w:ilvl w:val="0"/>
+          <w:numId w:val="7"/>
+        </w:numPr>
+      </w:pPr>
+      <w:r>
+        <w:t xml:space="preserve">If the relationship exists, </w:t>
+      </w:r>
+      <w:proofErr w:type="gramStart"/>
+      <w:r>
+        <w:t>I</w:t>
+      </w:r>
+      <w:r>
+        <w:t>s</w:t>
+      </w:r>
+      <w:proofErr w:type="gramEnd"/>
+      <w:r>
+        <w:t xml:space="preserve"> it a relationship that affects the assets on</w:t>
+      </w:r>
+      <w:r>
+        <w:t xml:space="preserve"> ‘average’ or </w:t>
+      </w:r>
+      <w:r>
+        <w:t>only in parts</w:t>
+      </w:r>
+      <w:r>
+        <w:t xml:space="preserve"> of the distributions</w:t>
+      </w:r>
+      <w:r>
+        <w:t xml:space="preserve"> (tails)</w:t>
+      </w:r>
+      <w:r>
+        <w:t>?</w:t>
+      </w:r>
+    </w:p>
+    <w:p>
+      <w:pPr>
+        <w:pStyle w:val="ListParagraph"/>
+        <w:numPr>
+          <w:ilvl w:val="0"/>
+          <w:numId w:val="7"/>
+        </w:numPr>
+      </w:pPr>
+      <w:r>
+        <w:t>IS there a cyclical/bidirectional relationship?</w:t>
+      </w:r>
+    </w:p>
+    <w:p>
+      <w:pPr>
+        <w:pStyle w:val="Heading2"/>
+      </w:pPr>
+      <w:r>
+        <w:t>2.1 Stationarity Testing</w:t>
+      </w:r>
+    </w:p>
+    <w:p>
+      <w:r>
+        <w:t xml:space="preserve">First, we test for stationarity in each of our </w:t>
+      </w:r>
+      <w:r>
+        <w:t xml:space="preserve">time series. We do this before </w:t>
+      </w:r>
+      <w:r>
+        <w:t>PCA</w:t>
+      </w:r>
+      <w:r>
+        <w:t xml:space="preserve"> as otherwise the generated </w:t>
+      </w:r>
+      <w:r>
+        <w:t>Principal</w:t>
+      </w:r>
+      <w:r>
+        <w:t xml:space="preserve"> Component</w:t>
+      </w:r>
+      <w:r>
+        <w:t xml:space="preserve"> series would tell us very little.</w:t>
+      </w:r>
+    </w:p>
+    <w:p>
+      <w:pPr>
+        <w:jc w:val="center"/>
+      </w:pPr>
+      <w:r>
+        <w:rPr>
+          <w:noProof/>
+        </w:rPr>
+        <w:drawing>
+          <wp:inline distT="0" distB="0" distL="0" distR="0" wp14:anchorId="05DCDD3B" wp14:editId="727B6ED7">
+            <wp:extent cx="3177540" cy="2176474"/>
+            <wp:effectExtent l="0" t="0" r="3810" b="0"/>
+            <wp:docPr id="1809550073" name="Picture 1"/>
+            <wp:cNvGraphicFramePr>
+              <a:graphicFrameLocks xmlns:a="http://schemas.openxmlformats.org/drawingml/2006/main" noChangeAspect="1"/>
+            </wp:cNvGraphicFramePr>
+            <a:graphic xmlns:a="http://schemas.openxmlformats.org/drawingml/2006/main">
+              <a:graphicData uri="http://schemas.openxmlformats.org/drawingml/2006/picture">
+                <pic:pic xmlns:pic="http://schemas.openxmlformats.org/drawingml/2006/picture">
+                  <pic:nvPicPr>
+                    <pic:cNvPr id="1809550073" name=""/>
+                    <pic:cNvPicPr/>
+                  </pic:nvPicPr>
+                  <pic:blipFill>
+                    <a:blip r:embed="rId6"/>
+                    <a:stretch>
+                      <a:fillRect/>
+                    </a:stretch>
+                  </pic:blipFill>
+                  <pic:spPr>
+                    <a:xfrm>
+                      <a:off x="0" y="0"/>
+                      <a:ext cx="3194215" cy="2187896"/>
+                    </a:xfrm>
+                    <a:prstGeom prst="rect">
+                      <a:avLst/>
+                    </a:prstGeom>
+                  </pic:spPr>
+                </pic:pic>
+              </a:graphicData>
+            </a:graphic>
+          </wp:inline>
+        </w:drawing>
+      </w:r>
+    </w:p>
+    <w:p>
+      <w:pPr>
+        <w:pStyle w:val="Heading2"/>
+      </w:pPr>
+      <w:r>
+        <w:t>2.2 Causality Testing</w:t>
+      </w:r>
+    </w:p>
+    <w:p>
+      <w:r>
+        <w:t xml:space="preserve">We use </w:t>
+      </w:r>
+      <w:r>
+        <w:rPr>
+          <w:b/>
+          <w:bCs/>
+        </w:rPr>
+        <w:t>Time-Varying Copula Granger Causality</w:t>
+      </w:r>
+      <w:r>
+        <w:rPr>
+          <w:b/>
+          <w:bCs/>
+        </w:rPr>
+        <w:t xml:space="preserve"> </w:t>
+      </w:r>
+      <w:r>
+        <w:t xml:space="preserve">for in-sample testing. </w:t>
+      </w:r>
+      <w:r>
+        <w:t>This offers numerous benefits over typical granger causality:</w:t>
+      </w:r>
+    </w:p>
+    <w:p>
+      <w:pPr>
+        <w:pStyle w:val="ListParagraph"/>
+        <w:numPr>
+          <w:ilvl w:val="0"/>
+          <w:numId w:val="7"/>
+        </w:numPr>
+      </w:pPr>
+      <w:r>
+        <w:t xml:space="preserve">Standard granger causality can only capture linear </w:t>
+      </w:r>
+      <w:proofErr w:type="gramStart"/>
+      <w:r>
+        <w:t>relationships,</w:t>
+      </w:r>
+      <w:proofErr w:type="gramEnd"/>
+      <w:r>
+        <w:t xml:space="preserve"> copula granger can capture nonlinear</w:t>
+      </w:r>
+    </w:p>
+    <w:p>
+      <w:pPr>
+        <w:pStyle w:val="ListParagraph"/>
+        <w:numPr>
+          <w:ilvl w:val="0"/>
+          <w:numId w:val="7"/>
+        </w:numPr>
+      </w:pPr>
+      <w:r>
+        <w:t>Standard granger only looks at the mean/average effect from one asset to another. Copula granger allows us to capture effects across the whole distribution. This includes</w:t>
+      </w:r>
+      <w:r>
+        <w:t xml:space="preserve"> mean, variance, skewness, tails, etc. </w:t>
+      </w:r>
+      <w:r>
+        <w:t xml:space="preserve"> </w:t>
+      </w:r>
+    </w:p>
+    <w:p>
+      <w:r>
+        <w:t xml:space="preserve">When we get significant p values in this test, it simply says that </w:t>
+      </w:r>
+      <w:proofErr w:type="gramStart"/>
+      <w:r>
+        <w:t>there</w:t>
+      </w:r>
+      <w:proofErr w:type="gramEnd"/>
+      <w:r>
+        <w:t xml:space="preserve"> significant causality on average,</w:t>
+      </w:r>
+      <w:r>
+        <w:t xml:space="preserve"> and we can look closer to see where the causality lies in the distribution. For now, we just use the p value to show nonlinear causality.</w:t>
+      </w:r>
+    </w:p>
+    <w:p>
+      <w:r>
+        <w:lastRenderedPageBreak/>
+        <w:t>We also introduce the use of time-varying copula. This is because crypto and stablecoin markets are evolving and so their relationships will change over time</w:t>
+      </w:r>
+      <w:r>
+        <w:t xml:space="preserve">. Currently, we use a rolling copula that we fit (NOT SURE </w:t>
+      </w:r>
+      <w:proofErr w:type="gramStart"/>
+      <w:r>
+        <w:t>YET</w:t>
+      </w:r>
+      <w:r>
+        <w:t>,</w:t>
+      </w:r>
+      <w:proofErr w:type="gramEnd"/>
+      <w:r>
+        <w:t xml:space="preserve"> 6 months?</w:t>
+      </w:r>
+      <w:r>
+        <w:t xml:space="preserve"> 12 months?</w:t>
+      </w:r>
+      <w:r>
+        <w:t>).</w:t>
+      </w:r>
+    </w:p>
+    <w:p>
+      <w:r>
+        <w:t>Use a rolling copula instead of expanding copula to</w:t>
+      </w:r>
+      <w:r>
+        <w:t xml:space="preserve"> mitigate old information from past regimes.</w:t>
+      </w:r>
+    </w:p>
+    <w:p>
+      <w:r>
+        <w:t xml:space="preserve">We also want to see the causality across different </w:t>
+      </w:r>
+      <w:proofErr w:type="gramStart"/>
+      <w:r>
+        <w:t>horizons,</w:t>
+      </w:r>
+      <w:proofErr w:type="gramEnd"/>
+      <w:r>
+        <w:t xml:space="preserve"> we use our daily data and transform it into </w:t>
+      </w:r>
+      <w:r>
+        <w:t>weekly and monthly data to see if causality lies at these different horizons.</w:t>
+      </w:r>
+    </w:p>
+    <w:p>
+      <w:r>
+        <w:t xml:space="preserve">From these tests, we </w:t>
+      </w:r>
+      <w:proofErr w:type="gramStart"/>
+      <w:r>
+        <w:t>are able to</w:t>
+      </w:r>
+      <w:proofErr w:type="gramEnd"/>
+      <w:r>
+        <w:t xml:space="preserve"> inform our feature selection in the OOS </w:t>
+      </w:r>
+      <w:proofErr w:type="spellStart"/>
+      <w:r>
+        <w:t>backtest</w:t>
+      </w:r>
+      <w:proofErr w:type="spellEnd"/>
+      <w:r>
+        <w:t>.</w:t>
+      </w:r>
+    </w:p>
+    <w:p>
+      <w:pPr>
+        <w:pStyle w:val="Heading2"/>
+      </w:pPr>
+      <w:r>
+        <w:t xml:space="preserve">2.3 OOS </w:t>
+      </w:r>
+      <w:proofErr w:type="spellStart"/>
+      <w:r>
+        <w:t>Backtest</w:t>
+      </w:r>
+      <w:proofErr w:type="spellEnd"/>
+    </w:p>
+    <w:p>
+      <w:r>
+        <w:t>We use a GARCH-</w:t>
+      </w:r>
+      <w:proofErr w:type="spellStart"/>
+      <w:r>
+        <w:t>XGBoost</w:t>
+      </w:r>
+      <w:proofErr w:type="spellEnd"/>
+      <w:r>
+        <w:t xml:space="preserve"> model where we </w:t>
+      </w:r>
+      <w:r>
+        <w:t xml:space="preserve">fit </w:t>
+      </w:r>
+      <w:proofErr w:type="spellStart"/>
+      <w:r>
+        <w:t>egarch</w:t>
+      </w:r>
+      <w:proofErr w:type="spellEnd"/>
+      <w:r>
+        <w:t xml:space="preserve"> models to our PCAs then use their shocks and volatility as features in an </w:t>
+      </w:r>
+      <w:proofErr w:type="spellStart"/>
+      <w:r>
+        <w:t>XGboost</w:t>
+      </w:r>
+      <w:proofErr w:type="spellEnd"/>
+      <w:r>
+        <w:t xml:space="preserve"> model.</w:t>
+      </w:r>
+    </w:p>
+    <w:p>
+      <w:r>
+        <w:t>We run 2 models:</w:t>
+      </w:r>
+    </w:p>
+    <w:p>
+      <w:pPr>
+        <w:pStyle w:val="ListParagraph"/>
+        <w:numPr>
+          <w:ilvl w:val="0"/>
+          <w:numId w:val="8"/>
+        </w:numPr>
+      </w:pPr>
+      <w:r>
+        <w:t>A benchmark model that only uses the target variables past data</w:t>
+      </w:r>
+    </w:p>
+    <w:p>
+      <w:pPr>
+        <w:pStyle w:val="ListParagraph"/>
+        <w:numPr>
+          <w:ilvl w:val="0"/>
+          <w:numId w:val="8"/>
+        </w:numPr>
+      </w:pPr>
+      <w:r>
+        <w:t xml:space="preserve">A challenger model that uses the targets variable and </w:t>
+      </w:r>
+      <w:r>
+        <w:t>predictor past data</w:t>
+      </w:r>
+    </w:p>
+    <w:p>
+      <w:r>
+        <w:drawing>
+          <wp:inline distT="0" distB="0" distL="0" distR="0" wp14:anchorId="5E0C8B85" wp14:editId="5F3B5E45">
+            <wp:extent cx="5731510" cy="2388235"/>
+            <wp:effectExtent l="0" t="0" r="2540" b="0"/>
+            <wp:docPr id="622919078" name="Picture 1"/>
+            <wp:cNvGraphicFramePr>
+              <a:graphicFrameLocks xmlns:a="http://schemas.openxmlformats.org/drawingml/2006/main" noChangeAspect="1"/>
+            </wp:cNvGraphicFramePr>
+            <a:graphic xmlns:a="http://schemas.openxmlformats.org/drawingml/2006/main">
+              <a:graphicData uri="http://schemas.openxmlformats.org/drawingml/2006/picture">
+                <pic:pic xmlns:pic="http://schemas.openxmlformats.org/drawingml/2006/picture">
+                  <pic:nvPicPr>
+                    <pic:cNvPr id="622919078" name=""/>
+                    <pic:cNvPicPr/>
+                  </pic:nvPicPr>
+                  <pic:blipFill>
+                    <a:blip r:embed="rId7"/>
+                    <a:stretch>
+                      <a:fillRect/>
+                    </a:stretch>
+                  </pic:blipFill>
+                  <pic:spPr>
+                    <a:xfrm>
+                      <a:off x="0" y="0"/>
+                      <a:ext cx="5731510" cy="2388235"/>
+                    </a:xfrm>
+                    <a:prstGeom prst="rect">
+                      <a:avLst/>
+                    </a:prstGeom>
+                  </pic:spPr>
+                </pic:pic>
+              </a:graphicData>
+            </a:graphic>
+          </wp:inline>
+        </w:drawing>
+      </w:r>
+    </w:p>
+    <w:p>
+      <w:r>
+        <w:t>We compare these models using MSE (testing significant changes using Diebold Mariano) and Sign</w:t>
+      </w:r>
+      <w:r>
+        <w:t xml:space="preserve"> Test (To see if it predicts the correct direction negative or positive)</w:t>
+      </w:r>
+      <w:r>
+        <w:t>. This gives us a complete picture on whether the stablecoin data gives information on the direction (sign change</w:t>
+      </w:r>
+      <w:r>
+        <w:t>) and magnitude/error (MSE).</w:t>
+      </w:r>
+    </w:p>
+    <w:p/>
+    <w:p/>
+    <w:p/>
+    <w:p/>
+    <w:p>
+      <w:r>
+        <w:lastRenderedPageBreak/>
+        <w:t xml:space="preserve">Significant </w:t>
+      </w:r>
+      <w:r>
+        <w:t xml:space="preserve">MSE reduction </w:t>
+      </w:r>
+      <w:r>
+        <w:t>Results:</w:t>
+      </w:r>
+    </w:p>
+    <w:p>
+      <w:r>
+        <w:drawing>
+          <wp:inline distT="0" distB="0" distL="0" distR="0" wp14:anchorId="67139FCE" wp14:editId="33747BDB">
+            <wp:extent cx="5116829" cy="1559169"/>
+            <wp:effectExtent l="0" t="0" r="8255" b="3175"/>
+            <wp:docPr id="1375450127" name="Picture 1" descr="A screenshot of a computer screen&#10;&#10;AI-generated content may be incorrect."/>
+            <wp:cNvGraphicFramePr>
+              <a:graphicFrameLocks xmlns:a="http://schemas.openxmlformats.org/drawingml/2006/main" noChangeAspect="1"/>
+            </wp:cNvGraphicFramePr>
+            <a:graphic xmlns:a="http://schemas.openxmlformats.org/drawingml/2006/main">
+              <a:graphicData uri="http://schemas.openxmlformats.org/drawingml/2006/picture">
+                <pic:pic xmlns:pic="http://schemas.openxmlformats.org/drawingml/2006/picture">
+                  <pic:nvPicPr>
+                    <pic:cNvPr id="1375450127" name="Picture 1" descr="A screenshot of a computer screen&#10;&#10;AI-generated content may be incorrect."/>
+                    <pic:cNvPicPr/>
+                  </pic:nvPicPr>
+                  <pic:blipFill>
+                    <a:blip r:embed="rId8"/>
+                    <a:stretch>
+                      <a:fillRect/>
+                    </a:stretch>
+                  </pic:blipFill>
+                  <pic:spPr>
+                    <a:xfrm>
+                      <a:off x="0" y="0"/>
+                      <a:ext cx="5127907" cy="1562545"/>
+                    </a:xfrm>
+                    <a:prstGeom prst="rect">
+                      <a:avLst/>
+                    </a:prstGeom>
+                  </pic:spPr>
+                </pic:pic>
+              </a:graphicData>
+            </a:graphic>
+          </wp:inline>
+        </w:drawing>
+      </w:r>
+    </w:p>
+    <w:p>
+      <w:r>
+        <w:t>Positive Directional Accuracy</w:t>
+      </w:r>
+      <w:r>
+        <w:t xml:space="preserve"> Results:</w:t>
+      </w:r>
+    </w:p>
+    <w:p>
+      <w:r>
+        <w:drawing>
+          <wp:inline distT="0" distB="0" distL="0" distR="0" wp14:anchorId="06F2D842" wp14:editId="318A9634">
+            <wp:extent cx="5201376" cy="1133633"/>
+            <wp:effectExtent l="0" t="0" r="0" b="9525"/>
+            <wp:docPr id="1451469321" name="Picture 1" descr="A screenshot of a computer screen&#10;&#10;AI-generated content may be incorrect."/>
+            <wp:cNvGraphicFramePr>
+              <a:graphicFrameLocks xmlns:a="http://schemas.openxmlformats.org/drawingml/2006/main" noChangeAspect="1"/>
+            </wp:cNvGraphicFramePr>
+            <a:graphic xmlns:a="http://schemas.openxmlformats.org/drawingml/2006/main">
+              <a:graphicData uri="http://schemas.openxmlformats.org/drawingml/2006/picture">
+                <pic:pic xmlns:pic="http://schemas.openxmlformats.org/drawingml/2006/picture">
+                  <pic:nvPicPr>
+                    <pic:cNvPr id="1451469321" name="Picture 1" descr="A screenshot of a computer screen&#10;&#10;AI-generated content may be incorrect."/>
+                    <pic:cNvPicPr/>
+                  </pic:nvPicPr>
+                  <pic:blipFill>
+                    <a:blip r:embed="rId9"/>
+                    <a:stretch>
+                      <a:fillRect/>
+                    </a:stretch>
+                  </pic:blipFill>
+                  <pic:spPr>
+                    <a:xfrm>
+                      <a:off x="0" y="0"/>
+                      <a:ext cx="5201376" cy="1133633"/>
+                    </a:xfrm>
+                    <a:prstGeom prst="rect">
+                      <a:avLst/>
+                    </a:prstGeom>
+                  </pic:spPr>
+                </pic:pic>
+              </a:graphicData>
+            </a:graphic>
+          </wp:inline>
+        </w:drawing>
+      </w:r>
+    </w:p>
+    <w:p>
+      <w:pPr>
+        <w:pStyle w:val="Heading2"/>
+      </w:pPr>
+      <w:r>
+        <w:t xml:space="preserve">2.4 </w:t>
+      </w:r>
+      <w:r>
+        <w:t>OOS Trading With actual Asset</w:t>
+      </w:r>
+    </w:p>
+    <w:p>
+      <w:r>
+        <w:t xml:space="preserve">Now we have shown the general predictive power across markets, </w:t>
+      </w:r>
+      <w:proofErr w:type="gramStart"/>
+      <w:r>
+        <w:t>We</w:t>
+      </w:r>
+      <w:proofErr w:type="gramEnd"/>
+      <w:r>
+        <w:t xml:space="preserve"> use our PCs of the stablecoin data to predict a specific asset</w:t>
+      </w:r>
+      <w:r>
+        <w:t>’s</w:t>
+      </w:r>
+      <w:r>
+        <w:t xml:space="preserve"> returns (For example, Bitcoin)</w:t>
+      </w:r>
+    </w:p>
+    <w:p>
+      <w:r>
+        <w:t>We should use the Sortino Ratio as this does not penalise</w:t>
+      </w:r>
+      <w:r>
+        <w:t xml:space="preserve"> increased volatility in the upside (Where we make more money!)</w:t>
+      </w:r>
+    </w:p>
+    <w:p/>
+    <w:p/>
+    <w:p/>
+    <w:p/>
+    <w:p/>
+    <w:p/>
+    <w:p/>
+    <w:p/>
+    <w:p/>
+    <w:p/>
+    <w:p/>
+    <w:p/>
+    <w:p/>
+    <w:p/>
+    <w:p/>
+    <w:p/>
+    <w:p/>
+    <w:p/>
+    <w:p/>
+    <w:p/>
+    <w:p/>
+    <w:p/>
+    <w:p/>
+    <w:p/>
+    <w:p/>
+    <w:p>
+      <w:r>
+        <w:t>We conduct 3 main tests:</w:t>
+      </w:r>
+    </w:p>
+    <w:p>
+      <w:pPr>
+        <w:pStyle w:val="ListParagraph"/>
+        <w:numPr>
+          <w:ilvl w:val="0"/>
+          <w:numId w:val="1"/>
+        </w:numPr>
+      </w:pPr>
+      <w:r>
+        <w:t>Copula Granger Causality (In Sample)</w:t>
+      </w:r>
+    </w:p>
+    <w:p>
+      <w:pPr>
+        <w:pStyle w:val="ListParagraph"/>
+        <w:numPr>
+          <w:ilvl w:val="0"/>
+          <w:numId w:val="1"/>
+        </w:numPr>
+      </w:pPr>
+      <w:r>
+        <w:t xml:space="preserve">Copula – GARCH forecasting (OOS, </w:t>
+      </w:r>
+      <w:proofErr w:type="spellStart"/>
+      <w:r>
+        <w:t>LogLikelihood</w:t>
+      </w:r>
+      <w:proofErr w:type="spellEnd"/>
+      <w:r>
+        <w:t xml:space="preserve"> and </w:t>
+      </w:r>
+      <w:proofErr w:type="spellStart"/>
+      <w:r>
+        <w:t>VaR</w:t>
+      </w:r>
+      <w:proofErr w:type="spellEnd"/>
+      <w:r>
+        <w:t>)</w:t>
+      </w:r>
+    </w:p>
+    <w:p>
+      <w:pPr>
+        <w:pStyle w:val="ListParagraph"/>
+        <w:numPr>
+          <w:ilvl w:val="0"/>
+          <w:numId w:val="1"/>
+        </w:numPr>
+      </w:pPr>
+      <w:r>
         <w:t xml:space="preserve">Copula – ML forecasting (OOS, </w:t>
       </w:r>
       <w:proofErr w:type="spellStart"/>
@@ -850,7 +1821,6 @@
     </w:p>
     <w:p>
       <w:r>
-        <w:lastRenderedPageBreak/>
         <w:t>We now breakdown the purpose of each test and why we use a copula</w:t>
       </w:r>
       <w:r>
@@ -891,6 +1861,7 @@
                 <w:sz w:val="22"/>
                 <w:szCs w:val="22"/>
               </w:rPr>
+              <w:lastRenderedPageBreak/>
               <w:t>Test</w:t>
             </w:r>
           </w:p>
@@ -1389,14 +2360,7 @@
                 <w:sz w:val="22"/>
                 <w:szCs w:val="22"/>
               </w:rPr>
-              <w:t>)</w:t>
-            </w:r>
-            <w:r>
-              <w:rPr>
-                <w:sz w:val="22"/>
-                <w:szCs w:val="22"/>
-              </w:rPr>
-              <w:t xml:space="preserve"> that Stablecoin carries predictive power</w:t>
+              <w:t>) that Stablecoin carries predictive power</w:t>
             </w:r>
           </w:p>
           <w:p>
@@ -1514,12 +2478,21 @@
               </w:rPr>
               <w:t>“</w:t>
             </w:r>
-            <w:r>
-              <w:rPr>
-                <w:sz w:val="22"/>
-                <w:szCs w:val="22"/>
-              </w:rPr>
-              <w:t>given yesterday’s</w:t>
+            <w:proofErr w:type="gramStart"/>
+            <w:r>
+              <w:rPr>
+                <w:sz w:val="22"/>
+                <w:szCs w:val="22"/>
+              </w:rPr>
+              <w:t>given</w:t>
+            </w:r>
+            <w:proofErr w:type="gramEnd"/>
+            <w:r>
+              <w:rPr>
+                <w:sz w:val="22"/>
+                <w:szCs w:val="22"/>
+              </w:rPr>
+              <w:t xml:space="preserve"> yesterday’s</w:t>
             </w:r>
             <w:r>
               <w:rPr>
@@ -1700,50 +2673,22 @@
                 <w:sz w:val="22"/>
                 <w:szCs w:val="22"/>
               </w:rPr>
-              <w:t>Statistical Proof (</w:t>
-            </w:r>
-            <w:r>
-              <w:rPr>
-                <w:sz w:val="22"/>
-                <w:szCs w:val="22"/>
-              </w:rPr>
-              <w:t>MSE</w:t>
-            </w:r>
-            <w:r>
-              <w:rPr>
-                <w:sz w:val="22"/>
-                <w:szCs w:val="22"/>
-              </w:rPr>
-              <w:t xml:space="preserve">) and </w:t>
-            </w:r>
-          </w:p>
-          <w:p>
-            <w:pPr>
-              <w:rPr>
-                <w:sz w:val="22"/>
-                <w:szCs w:val="22"/>
-              </w:rPr>
-            </w:pPr>
-            <w:r>
-              <w:rPr>
-                <w:sz w:val="22"/>
-                <w:szCs w:val="22"/>
-              </w:rPr>
-              <w:t>Economic Proof (</w:t>
-            </w:r>
-            <w:r>
-              <w:rPr>
-                <w:sz w:val="22"/>
-                <w:szCs w:val="22"/>
-              </w:rPr>
-              <w:t>Sharpe</w:t>
-            </w:r>
-            <w:r>
-              <w:rPr>
-                <w:sz w:val="22"/>
-                <w:szCs w:val="22"/>
-              </w:rPr>
-              <w:t xml:space="preserve"> </w:t>
+              <w:t xml:space="preserve">Statistical Proof (MSE) and </w:t>
+            </w:r>
+          </w:p>
+          <w:p>
+            <w:pPr>
+              <w:rPr>
+                <w:sz w:val="22"/>
+                <w:szCs w:val="22"/>
+              </w:rPr>
+            </w:pPr>
+            <w:r>
+              <w:rPr>
+                <w:sz w:val="22"/>
+                <w:szCs w:val="22"/>
+              </w:rPr>
+              <w:t xml:space="preserve">Economic Proof (Sharpe </w:t>
             </w:r>
             <w:proofErr w:type="spellStart"/>
             <w:r>
@@ -1902,7 +2847,6 @@
     </w:p>
     <w:p>
       <w:r>
-        <w:lastRenderedPageBreak/>
         <w:t>In the following table, we explain the specific methodologies of each test:</w:t>
       </w:r>
     </w:p>
@@ -2195,7 +3139,15 @@
               </w:numPr>
             </w:pPr>
             <w:r>
-              <w:t>Fit a AR</w:t>
+              <w:t xml:space="preserve">Fit </w:t>
+            </w:r>
+            <w:proofErr w:type="gramStart"/>
+            <w:r>
+              <w:t>a</w:t>
+            </w:r>
+            <w:proofErr w:type="gramEnd"/>
+            <w:r>
+              <w:t xml:space="preserve"> AR</w:t>
             </w:r>
             <w:r>
               <w:t xml:space="preserve"> </w:t>
@@ -2219,7 +3171,15 @@
               <w:t xml:space="preserve"> mean</w:t>
             </w:r>
             <w:r>
-              <w:t xml:space="preserve"> then the GARCH part models the shocks from the AR model. This ensures the shocks are ‘clean’  and uncorrelated</w:t>
+              <w:t xml:space="preserve"> then the GARCH part models the shocks from the AR model. This ensures the shocks are ‘clean</w:t>
+            </w:r>
+            <w:proofErr w:type="gramStart"/>
+            <w:r>
+              <w:t>’  and</w:t>
+            </w:r>
+            <w:proofErr w:type="gramEnd"/>
+            <w:r>
+              <w:t xml:space="preserve"> uncorrelated</w:t>
             </w:r>
           </w:p>
           <w:p>
@@ -2285,7 +3245,15 @@
               </w:numPr>
             </w:pPr>
             <w:r>
-              <w:t>Compare our copula model with the standard GARCH model for total log likelihood over the 1 year test set. Use a</w:t>
+              <w:t xml:space="preserve">Compare our copula model with the standard GARCH model for total log likelihood over the </w:t>
+            </w:r>
+            <w:proofErr w:type="gramStart"/>
+            <w:r>
+              <w:t>1 year</w:t>
+            </w:r>
+            <w:proofErr w:type="gramEnd"/>
+            <w:r>
+              <w:t xml:space="preserve"> test set. Use a</w:t>
             </w:r>
             <w:r>
               <w:t>n</w:t>
@@ -2345,7 +3313,6 @@
                 <w:sz w:val="22"/>
                 <w:szCs w:val="22"/>
               </w:rPr>
-              <w:lastRenderedPageBreak/>
               <w:t>ML (</w:t>
             </w:r>
             <w:proofErr w:type="spellStart"/>
@@ -2391,7 +3358,16 @@
               </w:numPr>
             </w:pPr>
             <w:r>
-              <w:t>Fit a AR – GARCH model to each PCA series</w:t>
+              <w:lastRenderedPageBreak/>
+              <w:t xml:space="preserve">Fit </w:t>
+            </w:r>
+            <w:proofErr w:type="gramStart"/>
+            <w:r>
+              <w:t>a</w:t>
+            </w:r>
+            <w:proofErr w:type="gramEnd"/>
+            <w:r>
+              <w:t xml:space="preserve"> AR – GARCH model to each PCA series</w:t>
             </w:r>
             <w:r>
               <w:t xml:space="preserve"> to be left with the shocks</w:t>
@@ -2470,10 +3446,7 @@
             </w:r>
             <w:proofErr w:type="spellEnd"/>
             <w:r>
-              <w:t xml:space="preserve"> model </w:t>
-            </w:r>
-            <w:r>
-              <w:t xml:space="preserve">by </w:t>
+              <w:t xml:space="preserve"> model by </w:t>
             </w:r>
             <w:r>
               <w:t>comparing MSE values</w:t>
@@ -2525,6 +3498,9 @@
     </w:p>
     <w:p>
       <w:r>
+        <w:rPr>
+          <w:noProof/>
+        </w:rPr>
         <w:drawing>
           <wp:inline distT="0" distB="0" distL="0" distR="0" wp14:anchorId="3AA8C6A2" wp14:editId="5A1E9B94">
             <wp:extent cx="5410955" cy="2524477"/>
@@ -2541,7 +3517,7 @@
                     <pic:cNvPicPr/>
                   </pic:nvPicPr>
                   <pic:blipFill>
-                    <a:blip r:embed="rId5"/>
+                    <a:blip r:embed="rId10"/>
                     <a:stretch>
                       <a:fillRect/>
                     </a:stretch>
@@ -2569,6 +3545,9 @@
     </w:p>
     <w:p>
       <w:r>
+        <w:rPr>
+          <w:noProof/>
+        </w:rPr>
         <w:drawing>
           <wp:inline distT="0" distB="0" distL="0" distR="0" wp14:anchorId="7FA88B0B" wp14:editId="79ABB688">
             <wp:extent cx="4706007" cy="1047896"/>
@@ -2585,7 +3564,7 @@
                     <pic:cNvPicPr/>
                   </pic:nvPicPr>
                   <pic:blipFill>
-                    <a:blip r:embed="rId6"/>
+                    <a:blip r:embed="rId11"/>
                     <a:stretch>
                       <a:fillRect/>
                     </a:stretch>
@@ -2608,6 +3587,9 @@
     </w:p>
     <w:p>
       <w:r>
+        <w:rPr>
+          <w:noProof/>
+        </w:rPr>
         <w:lastRenderedPageBreak/>
         <w:drawing>
           <wp:inline distT="0" distB="0" distL="0" distR="0" wp14:anchorId="5A253989" wp14:editId="7124D5B0">
@@ -2625,7 +3607,7 @@
                     <pic:cNvPicPr/>
                   </pic:nvPicPr>
                   <pic:blipFill>
-                    <a:blip r:embed="rId7"/>
+                    <a:blip r:embed="rId12"/>
                     <a:stretch>
                       <a:fillRect/>
                     </a:stretch>
@@ -2648,6 +3630,9 @@
     </w:p>
     <w:p>
       <w:r>
+        <w:rPr>
+          <w:noProof/>
+        </w:rPr>
         <w:drawing>
           <wp:inline distT="0" distB="0" distL="0" distR="0" wp14:anchorId="20004951" wp14:editId="6EC7CF11">
             <wp:extent cx="4429125" cy="2627248"/>
@@ -2664,7 +3649,7 @@
                     <pic:cNvPicPr/>
                   </pic:nvPicPr>
                   <pic:blipFill>
-                    <a:blip r:embed="rId8"/>
+                    <a:blip r:embed="rId13"/>
                     <a:stretch>
                       <a:fillRect/>
                     </a:stretch>
@@ -2685,6 +3670,9 @@
         </w:drawing>
       </w:r>
       <w:r>
+        <w:rPr>
+          <w:noProof/>
+        </w:rPr>
         <w:drawing>
           <wp:inline distT="0" distB="0" distL="0" distR="0" wp14:anchorId="2EFE30A7" wp14:editId="3BBD786C">
             <wp:extent cx="4495800" cy="2942243"/>
@@ -2701,7 +3689,7 @@
                     <pic:cNvPicPr/>
                   </pic:nvPicPr>
                   <pic:blipFill>
-                    <a:blip r:embed="rId9"/>
+                    <a:blip r:embed="rId14"/>
                     <a:stretch>
                       <a:fillRect/>
                     </a:stretch>
@@ -2724,6 +3712,9 @@
     </w:p>
     <w:p>
       <w:r>
+        <w:rPr>
+          <w:noProof/>
+        </w:rPr>
         <w:lastRenderedPageBreak/>
         <w:drawing>
           <wp:inline distT="0" distB="0" distL="0" distR="0" wp14:anchorId="091B0BD0" wp14:editId="2A03B077">
@@ -2741,7 +3732,7 @@
                     <pic:cNvPicPr/>
                   </pic:nvPicPr>
                   <pic:blipFill>
-                    <a:blip r:embed="rId10"/>
+                    <a:blip r:embed="rId15"/>
                     <a:stretch>
                       <a:fillRect/>
                     </a:stretch>
@@ -2818,7 +3809,7 @@
                     <pic:cNvPicPr/>
                   </pic:nvPicPr>
                   <pic:blipFill>
-                    <a:blip r:embed="rId11"/>
+                    <a:blip r:embed="rId16"/>
                     <a:stretch>
                       <a:fillRect/>
                     </a:stretch>
@@ -2850,6 +3841,7 @@
         <w:rPr>
           <w:b/>
           <w:bCs/>
+          <w:noProof/>
         </w:rPr>
         <w:drawing>
           <wp:inline distT="0" distB="0" distL="0" distR="0" wp14:anchorId="3CFD7DF1" wp14:editId="76D0882E">
@@ -2867,7 +3859,7 @@
                     <pic:cNvPicPr/>
                   </pic:nvPicPr>
                   <pic:blipFill>
-                    <a:blip r:embed="rId12"/>
+                    <a:blip r:embed="rId17"/>
                     <a:stretch>
                       <a:fillRect/>
                     </a:stretch>
@@ -2899,6 +3891,7 @@
         <w:rPr>
           <w:b/>
           <w:bCs/>
+          <w:noProof/>
         </w:rPr>
         <w:lastRenderedPageBreak/>
         <w:drawing>
@@ -2917,7 +3910,7 @@
                     <pic:cNvPicPr/>
                   </pic:nvPicPr>
                   <pic:blipFill>
-                    <a:blip r:embed="rId13"/>
+                    <a:blip r:embed="rId18"/>
                     <a:stretch>
                       <a:fillRect/>
                     </a:stretch>
@@ -2949,6 +3942,7 @@
         <w:rPr>
           <w:b/>
           <w:bCs/>
+          <w:noProof/>
         </w:rPr>
         <w:drawing>
           <wp:inline distT="0" distB="0" distL="0" distR="0" wp14:anchorId="35D11280" wp14:editId="78D679F8">
@@ -2966,7 +3960,7 @@
                     <pic:cNvPicPr/>
                   </pic:nvPicPr>
                   <pic:blipFill>
-                    <a:blip r:embed="rId14"/>
+                    <a:blip r:embed="rId19"/>
                     <a:stretch>
                       <a:fillRect/>
                     </a:stretch>
@@ -2998,6 +3992,7 @@
         <w:rPr>
           <w:b/>
           <w:bCs/>
+          <w:noProof/>
         </w:rPr>
         <w:drawing>
           <wp:inline distT="0" distB="0" distL="0" distR="0" wp14:anchorId="41FA1398" wp14:editId="551C34E1">
@@ -3015,7 +4010,7 @@
                     <pic:cNvPicPr/>
                   </pic:nvPicPr>
                   <pic:blipFill>
-                    <a:blip r:embed="rId15"/>
+                    <a:blip r:embed="rId20"/>
                     <a:stretch>
                       <a:fillRect/>
                     </a:stretch>
@@ -3103,7 +4098,7 @@
                     <pic:cNvPicPr/>
                   </pic:nvPicPr>
                   <pic:blipFill>
-                    <a:blip r:embed="rId16"/>
+                    <a:blip r:embed="rId21"/>
                     <a:stretch>
                       <a:fillRect/>
                     </a:stretch>
@@ -3145,7 +4140,7 @@
                     <pic:cNvPicPr/>
                   </pic:nvPicPr>
                   <pic:blipFill>
-                    <a:blip r:embed="rId17"/>
+                    <a:blip r:embed="rId22"/>
                     <a:stretch>
                       <a:fillRect/>
                     </a:stretch>
@@ -3177,6 +4172,7 @@
         <w:rPr>
           <w:b/>
           <w:bCs/>
+          <w:noProof/>
         </w:rPr>
         <w:drawing>
           <wp:inline distT="0" distB="0" distL="0" distR="0" wp14:anchorId="529EE6AE" wp14:editId="40CA3826">
@@ -3194,7 +4190,7 @@
                     <pic:cNvPicPr/>
                   </pic:nvPicPr>
                   <pic:blipFill>
-                    <a:blip r:embed="rId18"/>
+                    <a:blip r:embed="rId23"/>
                     <a:stretch>
                       <a:fillRect/>
                     </a:stretch>
@@ -3226,6 +4222,7 @@
         <w:rPr>
           <w:b/>
           <w:bCs/>
+          <w:noProof/>
         </w:rPr>
         <w:drawing>
           <wp:inline distT="0" distB="0" distL="0" distR="0" wp14:anchorId="405416DE" wp14:editId="0BAFCCC3">
@@ -3243,7 +4240,7 @@
                     <pic:cNvPicPr/>
                   </pic:nvPicPr>
                   <pic:blipFill>
-                    <a:blip r:embed="rId19"/>
+                    <a:blip r:embed="rId24"/>
                     <a:stretch>
                       <a:fillRect/>
                     </a:stretch>
@@ -3324,7 +4321,7 @@
                     <pic:cNvPicPr/>
                   </pic:nvPicPr>
                   <pic:blipFill>
-                    <a:blip r:embed="rId20"/>
+                    <a:blip r:embed="rId25"/>
                     <a:stretch>
                       <a:fillRect/>
                     </a:stretch>
@@ -3358,6 +4355,586 @@
 <file path=word/numbering.xml><?xml version="1.0" encoding="utf-8"?>
 <w:numbering xmlns:wpc="http://schemas.microsoft.com/office/word/2010/wordprocessingCanvas" xmlns:cx="http://schemas.microsoft.com/office/drawing/2014/chartex" xmlns:cx1="http://schemas.microsoft.com/office/drawing/2015/9/8/chartex" xmlns:cx2="http://schemas.microsoft.com/office/drawing/2015/10/21/chartex" xmlns:cx3="http://schemas.microsoft.com/office/drawing/2016/5/9/chartex" xmlns:cx4="http://schemas.microsoft.com/office/drawing/2016/5/10/chartex" xmlns:cx5="http://schemas.microsoft.com/office/drawing/2016/5/11/chartex" xmlns:cx6="http://schemas.microsoft.com/office/drawing/2016/5/12/chartex" xmlns:cx7="http://schemas.microsoft.com/office/drawing/2016/5/13/chartex" xmlns:cx8="http://schemas.microsoft.com/office/drawing/2016/5/14/chartex" xmlns:mc="http://schemas.openxmlformats.org/markup-compatibility/2006" xmlns:aink="http://schemas.microsoft.com/office/drawing/2016/ink" xmlns:am3d="http://schemas.microsoft.com/office/drawing/2017/model3d" xmlns:o="urn:schemas-microsoft-com:office:office" xmlns:oel="http://schemas.microsoft.com/office/2019/extlst" xmlns:r="http://schemas.openxmlformats.org/officeDocument/2006/relationships" xmlns:m="http://schemas.openxmlformats.org/officeDocument/2006/math" xmlns:v="urn:schemas-microsoft-com:vml" xmlns:wp14="http://schemas.microsoft.com/office/word/2010/wordprocessingDrawing" xmlns:wp="http://schemas.openxmlformats.org/drawingml/2006/wordprocessingDrawing" xmlns:w10="urn:schemas-microsoft-com:office:word" xmlns:w="http://schemas.openxmlformats.org/wordprocessingml/2006/main" xmlns:w14="http://schemas.microsoft.com/office/word/2010/wordml" xmlns:w15="http://schemas.microsoft.com/office/word/2012/wordml" xmlns:w16cex="http://schemas.microsoft.com/office/word/2018/wordml/cex" xmlns:w16cid="http://schemas.microsoft.com/office/word/2016/wordml/cid" xmlns:w16="http://schemas.microsoft.com/office/word/2018/wordml" xmlns:w16du="http://schemas.microsoft.com/office/word/2023/wordml/word16du" xmlns:w16sdtdh="http://schemas.microsoft.com/office/word/2020/wordml/sdtdatahash" xmlns:w16sdtfl="http://schemas.microsoft.com/office/word/2024/wordml/sdtformatlock" xmlns:w16se="http://schemas.microsoft.com/office/word/2015/wordml/symex" xmlns:wpg="http://schemas.microsoft.com/office/word/2010/wordprocessingGroup" xmlns:wpi="http://schemas.microsoft.com/office/word/2010/wordprocessingInk" xmlns:wne="http://schemas.microsoft.com/office/word/2006/wordml" xmlns:wps="http://schemas.microsoft.com/office/word/2010/wordprocessingShape" mc:Ignorable="w14 w15 w16se w16cid w16 w16cex w16sdtdh w16sdtfl w16du wp14">
   <w:abstractNum w:abstractNumId="0" w15:restartNumberingAfterBreak="0">
+    <w:nsid w:val="0823682E"/>
+    <w:multiLevelType w:val="hybridMultilevel"/>
+    <w:tmpl w:val="BFAE280E"/>
+    <w:lvl w:ilvl="0" w:tplc="0809000F">
+      <w:start w:val="1"/>
+      <w:numFmt w:val="decimal"/>
+      <w:lvlText w:val="%1."/>
+      <w:lvlJc w:val="left"/>
+      <w:pPr>
+        <w:ind w:left="720" w:hanging="360"/>
+      </w:pPr>
+      <w:rPr>
+        <w:rFonts w:hint="default"/>
+      </w:rPr>
+    </w:lvl>
+    <w:lvl w:ilvl="1" w:tplc="08090019" w:tentative="1">
+      <w:start w:val="1"/>
+      <w:numFmt w:val="lowerLetter"/>
+      <w:lvlText w:val="%2."/>
+      <w:lvlJc w:val="left"/>
+      <w:pPr>
+        <w:ind w:left="1440" w:hanging="360"/>
+      </w:pPr>
+    </w:lvl>
+    <w:lvl w:ilvl="2" w:tplc="0809001B" w:tentative="1">
+      <w:start w:val="1"/>
+      <w:numFmt w:val="lowerRoman"/>
+      <w:lvlText w:val="%3."/>
+      <w:lvlJc w:val="right"/>
+      <w:pPr>
+        <w:ind w:left="2160" w:hanging="180"/>
+      </w:pPr>
+    </w:lvl>
+    <w:lvl w:ilvl="3" w:tplc="0809000F" w:tentative="1">
+      <w:start w:val="1"/>
+      <w:numFmt w:val="decimal"/>
+      <w:lvlText w:val="%4."/>
+      <w:lvlJc w:val="left"/>
+      <w:pPr>
+        <w:ind w:left="2880" w:hanging="360"/>
+      </w:pPr>
+    </w:lvl>
+    <w:lvl w:ilvl="4" w:tplc="08090019" w:tentative="1">
+      <w:start w:val="1"/>
+      <w:numFmt w:val="lowerLetter"/>
+      <w:lvlText w:val="%5."/>
+      <w:lvlJc w:val="left"/>
+      <w:pPr>
+        <w:ind w:left="3600" w:hanging="360"/>
+      </w:pPr>
+    </w:lvl>
+    <w:lvl w:ilvl="5" w:tplc="0809001B" w:tentative="1">
+      <w:start w:val="1"/>
+      <w:numFmt w:val="lowerRoman"/>
+      <w:lvlText w:val="%6."/>
+      <w:lvlJc w:val="right"/>
+      <w:pPr>
+        <w:ind w:left="4320" w:hanging="180"/>
+      </w:pPr>
+    </w:lvl>
+    <w:lvl w:ilvl="6" w:tplc="0809000F" w:tentative="1">
+      <w:start w:val="1"/>
+      <w:numFmt w:val="decimal"/>
+      <w:lvlText w:val="%7."/>
+      <w:lvlJc w:val="left"/>
+      <w:pPr>
+        <w:ind w:left="5040" w:hanging="360"/>
+      </w:pPr>
+    </w:lvl>
+    <w:lvl w:ilvl="7" w:tplc="08090019" w:tentative="1">
+      <w:start w:val="1"/>
+      <w:numFmt w:val="lowerLetter"/>
+      <w:lvlText w:val="%8."/>
+      <w:lvlJc w:val="left"/>
+      <w:pPr>
+        <w:ind w:left="5760" w:hanging="360"/>
+      </w:pPr>
+    </w:lvl>
+    <w:lvl w:ilvl="8" w:tplc="0809001B" w:tentative="1">
+      <w:start w:val="1"/>
+      <w:numFmt w:val="lowerRoman"/>
+      <w:lvlText w:val="%9."/>
+      <w:lvlJc w:val="right"/>
+      <w:pPr>
+        <w:ind w:left="6480" w:hanging="180"/>
+      </w:pPr>
+    </w:lvl>
+  </w:abstractNum>
+  <w:abstractNum w:abstractNumId="1" w15:restartNumberingAfterBreak="0">
+    <w:nsid w:val="0A9A6208"/>
+    <w:multiLevelType w:val="hybridMultilevel"/>
+    <w:tmpl w:val="51520A84"/>
+    <w:lvl w:ilvl="0" w:tplc="847AD6F2">
+      <w:numFmt w:val="bullet"/>
+      <w:lvlText w:val="-"/>
+      <w:lvlJc w:val="left"/>
+      <w:pPr>
+        <w:ind w:left="720" w:hanging="360"/>
+      </w:pPr>
+      <w:rPr>
+        <w:rFonts w:ascii="Aptos" w:eastAsiaTheme="minorHAnsi" w:hAnsi="Aptos" w:cstheme="minorBidi" w:hint="default"/>
+      </w:rPr>
+    </w:lvl>
+    <w:lvl w:ilvl="1" w:tplc="08090003" w:tentative="1">
+      <w:start w:val="1"/>
+      <w:numFmt w:val="bullet"/>
+      <w:lvlText w:val="o"/>
+      <w:lvlJc w:val="left"/>
+      <w:pPr>
+        <w:ind w:left="1440" w:hanging="360"/>
+      </w:pPr>
+      <w:rPr>
+        <w:rFonts w:ascii="Courier New" w:hAnsi="Courier New" w:cs="Courier New" w:hint="default"/>
+      </w:rPr>
+    </w:lvl>
+    <w:lvl w:ilvl="2" w:tplc="08090005" w:tentative="1">
+      <w:start w:val="1"/>
+      <w:numFmt w:val="bullet"/>
+      <w:lvlText w:val=""/>
+      <w:lvlJc w:val="left"/>
+      <w:pPr>
+        <w:ind w:left="2160" w:hanging="360"/>
+      </w:pPr>
+      <w:rPr>
+        <w:rFonts w:ascii="Wingdings" w:hAnsi="Wingdings" w:hint="default"/>
+      </w:rPr>
+    </w:lvl>
+    <w:lvl w:ilvl="3" w:tplc="08090001" w:tentative="1">
+      <w:start w:val="1"/>
+      <w:numFmt w:val="bullet"/>
+      <w:lvlText w:val=""/>
+      <w:lvlJc w:val="left"/>
+      <w:pPr>
+        <w:ind w:left="2880" w:hanging="360"/>
+      </w:pPr>
+      <w:rPr>
+        <w:rFonts w:ascii="Symbol" w:hAnsi="Symbol" w:hint="default"/>
+      </w:rPr>
+    </w:lvl>
+    <w:lvl w:ilvl="4" w:tplc="08090003" w:tentative="1">
+      <w:start w:val="1"/>
+      <w:numFmt w:val="bullet"/>
+      <w:lvlText w:val="o"/>
+      <w:lvlJc w:val="left"/>
+      <w:pPr>
+        <w:ind w:left="3600" w:hanging="360"/>
+      </w:pPr>
+      <w:rPr>
+        <w:rFonts w:ascii="Courier New" w:hAnsi="Courier New" w:cs="Courier New" w:hint="default"/>
+      </w:rPr>
+    </w:lvl>
+    <w:lvl w:ilvl="5" w:tplc="08090005" w:tentative="1">
+      <w:start w:val="1"/>
+      <w:numFmt w:val="bullet"/>
+      <w:lvlText w:val=""/>
+      <w:lvlJc w:val="left"/>
+      <w:pPr>
+        <w:ind w:left="4320" w:hanging="360"/>
+      </w:pPr>
+      <w:rPr>
+        <w:rFonts w:ascii="Wingdings" w:hAnsi="Wingdings" w:hint="default"/>
+      </w:rPr>
+    </w:lvl>
+    <w:lvl w:ilvl="6" w:tplc="08090001" w:tentative="1">
+      <w:start w:val="1"/>
+      <w:numFmt w:val="bullet"/>
+      <w:lvlText w:val=""/>
+      <w:lvlJc w:val="left"/>
+      <w:pPr>
+        <w:ind w:left="5040" w:hanging="360"/>
+      </w:pPr>
+      <w:rPr>
+        <w:rFonts w:ascii="Symbol" w:hAnsi="Symbol" w:hint="default"/>
+      </w:rPr>
+    </w:lvl>
+    <w:lvl w:ilvl="7" w:tplc="08090003" w:tentative="1">
+      <w:start w:val="1"/>
+      <w:numFmt w:val="bullet"/>
+      <w:lvlText w:val="o"/>
+      <w:lvlJc w:val="left"/>
+      <w:pPr>
+        <w:ind w:left="5760" w:hanging="360"/>
+      </w:pPr>
+      <w:rPr>
+        <w:rFonts w:ascii="Courier New" w:hAnsi="Courier New" w:cs="Courier New" w:hint="default"/>
+      </w:rPr>
+    </w:lvl>
+    <w:lvl w:ilvl="8" w:tplc="08090005" w:tentative="1">
+      <w:start w:val="1"/>
+      <w:numFmt w:val="bullet"/>
+      <w:lvlText w:val=""/>
+      <w:lvlJc w:val="left"/>
+      <w:pPr>
+        <w:ind w:left="6480" w:hanging="360"/>
+      </w:pPr>
+      <w:rPr>
+        <w:rFonts w:ascii="Wingdings" w:hAnsi="Wingdings" w:hint="default"/>
+      </w:rPr>
+    </w:lvl>
+  </w:abstractNum>
+  <w:abstractNum w:abstractNumId="2" w15:restartNumberingAfterBreak="0">
+    <w:nsid w:val="1CEF3AF4"/>
+    <w:multiLevelType w:val="hybridMultilevel"/>
+    <w:tmpl w:val="4AECD4B2"/>
+    <w:lvl w:ilvl="0" w:tplc="0809000F">
+      <w:start w:val="1"/>
+      <w:numFmt w:val="decimal"/>
+      <w:lvlText w:val="%1."/>
+      <w:lvlJc w:val="left"/>
+      <w:pPr>
+        <w:ind w:left="720" w:hanging="360"/>
+      </w:pPr>
+      <w:rPr>
+        <w:rFonts w:hint="default"/>
+      </w:rPr>
+    </w:lvl>
+    <w:lvl w:ilvl="1" w:tplc="08090019" w:tentative="1">
+      <w:start w:val="1"/>
+      <w:numFmt w:val="lowerLetter"/>
+      <w:lvlText w:val="%2."/>
+      <w:lvlJc w:val="left"/>
+      <w:pPr>
+        <w:ind w:left="1440" w:hanging="360"/>
+      </w:pPr>
+    </w:lvl>
+    <w:lvl w:ilvl="2" w:tplc="0809001B" w:tentative="1">
+      <w:start w:val="1"/>
+      <w:numFmt w:val="lowerRoman"/>
+      <w:lvlText w:val="%3."/>
+      <w:lvlJc w:val="right"/>
+      <w:pPr>
+        <w:ind w:left="2160" w:hanging="180"/>
+      </w:pPr>
+    </w:lvl>
+    <w:lvl w:ilvl="3" w:tplc="0809000F" w:tentative="1">
+      <w:start w:val="1"/>
+      <w:numFmt w:val="decimal"/>
+      <w:lvlText w:val="%4."/>
+      <w:lvlJc w:val="left"/>
+      <w:pPr>
+        <w:ind w:left="2880" w:hanging="360"/>
+      </w:pPr>
+    </w:lvl>
+    <w:lvl w:ilvl="4" w:tplc="08090019" w:tentative="1">
+      <w:start w:val="1"/>
+      <w:numFmt w:val="lowerLetter"/>
+      <w:lvlText w:val="%5."/>
+      <w:lvlJc w:val="left"/>
+      <w:pPr>
+        <w:ind w:left="3600" w:hanging="360"/>
+      </w:pPr>
+    </w:lvl>
+    <w:lvl w:ilvl="5" w:tplc="0809001B" w:tentative="1">
+      <w:start w:val="1"/>
+      <w:numFmt w:val="lowerRoman"/>
+      <w:lvlText w:val="%6."/>
+      <w:lvlJc w:val="right"/>
+      <w:pPr>
+        <w:ind w:left="4320" w:hanging="180"/>
+      </w:pPr>
+    </w:lvl>
+    <w:lvl w:ilvl="6" w:tplc="0809000F" w:tentative="1">
+      <w:start w:val="1"/>
+      <w:numFmt w:val="decimal"/>
+      <w:lvlText w:val="%7."/>
+      <w:lvlJc w:val="left"/>
+      <w:pPr>
+        <w:ind w:left="5040" w:hanging="360"/>
+      </w:pPr>
+    </w:lvl>
+    <w:lvl w:ilvl="7" w:tplc="08090019" w:tentative="1">
+      <w:start w:val="1"/>
+      <w:numFmt w:val="lowerLetter"/>
+      <w:lvlText w:val="%8."/>
+      <w:lvlJc w:val="left"/>
+      <w:pPr>
+        <w:ind w:left="5760" w:hanging="360"/>
+      </w:pPr>
+    </w:lvl>
+    <w:lvl w:ilvl="8" w:tplc="0809001B" w:tentative="1">
+      <w:start w:val="1"/>
+      <w:numFmt w:val="lowerRoman"/>
+      <w:lvlText w:val="%9."/>
+      <w:lvlJc w:val="right"/>
+      <w:pPr>
+        <w:ind w:left="6480" w:hanging="180"/>
+      </w:pPr>
+    </w:lvl>
+  </w:abstractNum>
+  <w:abstractNum w:abstractNumId="3" w15:restartNumberingAfterBreak="0">
+    <w:nsid w:val="398A1FF4"/>
+    <w:multiLevelType w:val="hybridMultilevel"/>
+    <w:tmpl w:val="86F4B5FA"/>
+    <w:lvl w:ilvl="0" w:tplc="0809000F">
+      <w:start w:val="1"/>
+      <w:numFmt w:val="decimal"/>
+      <w:lvlText w:val="%1."/>
+      <w:lvlJc w:val="left"/>
+      <w:pPr>
+        <w:ind w:left="720" w:hanging="360"/>
+      </w:pPr>
+      <w:rPr>
+        <w:rFonts w:hint="default"/>
+      </w:rPr>
+    </w:lvl>
+    <w:lvl w:ilvl="1" w:tplc="08090019" w:tentative="1">
+      <w:start w:val="1"/>
+      <w:numFmt w:val="lowerLetter"/>
+      <w:lvlText w:val="%2."/>
+      <w:lvlJc w:val="left"/>
+      <w:pPr>
+        <w:ind w:left="1440" w:hanging="360"/>
+      </w:pPr>
+    </w:lvl>
+    <w:lvl w:ilvl="2" w:tplc="0809001B" w:tentative="1">
+      <w:start w:val="1"/>
+      <w:numFmt w:val="lowerRoman"/>
+      <w:lvlText w:val="%3."/>
+      <w:lvlJc w:val="right"/>
+      <w:pPr>
+        <w:ind w:left="2160" w:hanging="180"/>
+      </w:pPr>
+    </w:lvl>
+    <w:lvl w:ilvl="3" w:tplc="0809000F" w:tentative="1">
+      <w:start w:val="1"/>
+      <w:numFmt w:val="decimal"/>
+      <w:lvlText w:val="%4."/>
+      <w:lvlJc w:val="left"/>
+      <w:pPr>
+        <w:ind w:left="2880" w:hanging="360"/>
+      </w:pPr>
+    </w:lvl>
+    <w:lvl w:ilvl="4" w:tplc="08090019" w:tentative="1">
+      <w:start w:val="1"/>
+      <w:numFmt w:val="lowerLetter"/>
+      <w:lvlText w:val="%5."/>
+      <w:lvlJc w:val="left"/>
+      <w:pPr>
+        <w:ind w:left="3600" w:hanging="360"/>
+      </w:pPr>
+    </w:lvl>
+    <w:lvl w:ilvl="5" w:tplc="0809001B" w:tentative="1">
+      <w:start w:val="1"/>
+      <w:numFmt w:val="lowerRoman"/>
+      <w:lvlText w:val="%6."/>
+      <w:lvlJc w:val="right"/>
+      <w:pPr>
+        <w:ind w:left="4320" w:hanging="180"/>
+      </w:pPr>
+    </w:lvl>
+    <w:lvl w:ilvl="6" w:tplc="0809000F" w:tentative="1">
+      <w:start w:val="1"/>
+      <w:numFmt w:val="decimal"/>
+      <w:lvlText w:val="%7."/>
+      <w:lvlJc w:val="left"/>
+      <w:pPr>
+        <w:ind w:left="5040" w:hanging="360"/>
+      </w:pPr>
+    </w:lvl>
+    <w:lvl w:ilvl="7" w:tplc="08090019" w:tentative="1">
+      <w:start w:val="1"/>
+      <w:numFmt w:val="lowerLetter"/>
+      <w:lvlText w:val="%8."/>
+      <w:lvlJc w:val="left"/>
+      <w:pPr>
+        <w:ind w:left="5760" w:hanging="360"/>
+      </w:pPr>
+    </w:lvl>
+    <w:lvl w:ilvl="8" w:tplc="0809001B" w:tentative="1">
+      <w:start w:val="1"/>
+      <w:numFmt w:val="lowerRoman"/>
+      <w:lvlText w:val="%9."/>
+      <w:lvlJc w:val="right"/>
+      <w:pPr>
+        <w:ind w:left="6480" w:hanging="180"/>
+      </w:pPr>
+    </w:lvl>
+  </w:abstractNum>
+  <w:abstractNum w:abstractNumId="4" w15:restartNumberingAfterBreak="0">
+    <w:nsid w:val="45726E74"/>
+    <w:multiLevelType w:val="hybridMultilevel"/>
+    <w:tmpl w:val="46301C16"/>
+    <w:lvl w:ilvl="0" w:tplc="847AD6F2">
+      <w:numFmt w:val="bullet"/>
+      <w:lvlText w:val="-"/>
+      <w:lvlJc w:val="left"/>
+      <w:pPr>
+        <w:ind w:left="720" w:hanging="360"/>
+      </w:pPr>
+      <w:rPr>
+        <w:rFonts w:ascii="Aptos" w:eastAsiaTheme="minorHAnsi" w:hAnsi="Aptos" w:cstheme="minorBidi" w:hint="default"/>
+      </w:rPr>
+    </w:lvl>
+    <w:lvl w:ilvl="1" w:tplc="08090003" w:tentative="1">
+      <w:start w:val="1"/>
+      <w:numFmt w:val="bullet"/>
+      <w:lvlText w:val="o"/>
+      <w:lvlJc w:val="left"/>
+      <w:pPr>
+        <w:ind w:left="1440" w:hanging="360"/>
+      </w:pPr>
+      <w:rPr>
+        <w:rFonts w:ascii="Courier New" w:hAnsi="Courier New" w:cs="Courier New" w:hint="default"/>
+      </w:rPr>
+    </w:lvl>
+    <w:lvl w:ilvl="2" w:tplc="08090005" w:tentative="1">
+      <w:start w:val="1"/>
+      <w:numFmt w:val="bullet"/>
+      <w:lvlText w:val=""/>
+      <w:lvlJc w:val="left"/>
+      <w:pPr>
+        <w:ind w:left="2160" w:hanging="360"/>
+      </w:pPr>
+      <w:rPr>
+        <w:rFonts w:ascii="Wingdings" w:hAnsi="Wingdings" w:hint="default"/>
+      </w:rPr>
+    </w:lvl>
+    <w:lvl w:ilvl="3" w:tplc="08090001" w:tentative="1">
+      <w:start w:val="1"/>
+      <w:numFmt w:val="bullet"/>
+      <w:lvlText w:val=""/>
+      <w:lvlJc w:val="left"/>
+      <w:pPr>
+        <w:ind w:left="2880" w:hanging="360"/>
+      </w:pPr>
+      <w:rPr>
+        <w:rFonts w:ascii="Symbol" w:hAnsi="Symbol" w:hint="default"/>
+      </w:rPr>
+    </w:lvl>
+    <w:lvl w:ilvl="4" w:tplc="08090003" w:tentative="1">
+      <w:start w:val="1"/>
+      <w:numFmt w:val="bullet"/>
+      <w:lvlText w:val="o"/>
+      <w:lvlJc w:val="left"/>
+      <w:pPr>
+        <w:ind w:left="3600" w:hanging="360"/>
+      </w:pPr>
+      <w:rPr>
+        <w:rFonts w:ascii="Courier New" w:hAnsi="Courier New" w:cs="Courier New" w:hint="default"/>
+      </w:rPr>
+    </w:lvl>
+    <w:lvl w:ilvl="5" w:tplc="08090005" w:tentative="1">
+      <w:start w:val="1"/>
+      <w:numFmt w:val="bullet"/>
+      <w:lvlText w:val=""/>
+      <w:lvlJc w:val="left"/>
+      <w:pPr>
+        <w:ind w:left="4320" w:hanging="360"/>
+      </w:pPr>
+      <w:rPr>
+        <w:rFonts w:ascii="Wingdings" w:hAnsi="Wingdings" w:hint="default"/>
+      </w:rPr>
+    </w:lvl>
+    <w:lvl w:ilvl="6" w:tplc="08090001" w:tentative="1">
+      <w:start w:val="1"/>
+      <w:numFmt w:val="bullet"/>
+      <w:lvlText w:val=""/>
+      <w:lvlJc w:val="left"/>
+      <w:pPr>
+        <w:ind w:left="5040" w:hanging="360"/>
+      </w:pPr>
+      <w:rPr>
+        <w:rFonts w:ascii="Symbol" w:hAnsi="Symbol" w:hint="default"/>
+      </w:rPr>
+    </w:lvl>
+    <w:lvl w:ilvl="7" w:tplc="08090003" w:tentative="1">
+      <w:start w:val="1"/>
+      <w:numFmt w:val="bullet"/>
+      <w:lvlText w:val="o"/>
+      <w:lvlJc w:val="left"/>
+      <w:pPr>
+        <w:ind w:left="5760" w:hanging="360"/>
+      </w:pPr>
+      <w:rPr>
+        <w:rFonts w:ascii="Courier New" w:hAnsi="Courier New" w:cs="Courier New" w:hint="default"/>
+      </w:rPr>
+    </w:lvl>
+    <w:lvl w:ilvl="8" w:tplc="08090005" w:tentative="1">
+      <w:start w:val="1"/>
+      <w:numFmt w:val="bullet"/>
+      <w:lvlText w:val=""/>
+      <w:lvlJc w:val="left"/>
+      <w:pPr>
+        <w:ind w:left="6480" w:hanging="360"/>
+      </w:pPr>
+      <w:rPr>
+        <w:rFonts w:ascii="Wingdings" w:hAnsi="Wingdings" w:hint="default"/>
+      </w:rPr>
+    </w:lvl>
+  </w:abstractNum>
+  <w:abstractNum w:abstractNumId="5" w15:restartNumberingAfterBreak="0">
+    <w:nsid w:val="46DE7625"/>
+    <w:multiLevelType w:val="hybridMultilevel"/>
+    <w:tmpl w:val="6B8AED8A"/>
+    <w:lvl w:ilvl="0" w:tplc="BEB26D8E">
+      <w:start w:val="1"/>
+      <w:numFmt w:val="decimal"/>
+      <w:lvlText w:val="%1"/>
+      <w:lvlJc w:val="left"/>
+      <w:pPr>
+        <w:ind w:left="720" w:hanging="360"/>
+      </w:pPr>
+      <w:rPr>
+        <w:rFonts w:hint="default"/>
+      </w:rPr>
+    </w:lvl>
+    <w:lvl w:ilvl="1" w:tplc="08090019" w:tentative="1">
+      <w:start w:val="1"/>
+      <w:numFmt w:val="lowerLetter"/>
+      <w:lvlText w:val="%2."/>
+      <w:lvlJc w:val="left"/>
+      <w:pPr>
+        <w:ind w:left="1440" w:hanging="360"/>
+      </w:pPr>
+    </w:lvl>
+    <w:lvl w:ilvl="2" w:tplc="0809001B" w:tentative="1">
+      <w:start w:val="1"/>
+      <w:numFmt w:val="lowerRoman"/>
+      <w:lvlText w:val="%3."/>
+      <w:lvlJc w:val="right"/>
+      <w:pPr>
+        <w:ind w:left="2160" w:hanging="180"/>
+      </w:pPr>
+    </w:lvl>
+    <w:lvl w:ilvl="3" w:tplc="0809000F" w:tentative="1">
+      <w:start w:val="1"/>
+      <w:numFmt w:val="decimal"/>
+      <w:lvlText w:val="%4."/>
+      <w:lvlJc w:val="left"/>
+      <w:pPr>
+        <w:ind w:left="2880" w:hanging="360"/>
+      </w:pPr>
+    </w:lvl>
+    <w:lvl w:ilvl="4" w:tplc="08090019" w:tentative="1">
+      <w:start w:val="1"/>
+      <w:numFmt w:val="lowerLetter"/>
+      <w:lvlText w:val="%5."/>
+      <w:lvlJc w:val="left"/>
+      <w:pPr>
+        <w:ind w:left="3600" w:hanging="360"/>
+      </w:pPr>
+    </w:lvl>
+    <w:lvl w:ilvl="5" w:tplc="0809001B" w:tentative="1">
+      <w:start w:val="1"/>
+      <w:numFmt w:val="lowerRoman"/>
+      <w:lvlText w:val="%6."/>
+      <w:lvlJc w:val="right"/>
+      <w:pPr>
+        <w:ind w:left="4320" w:hanging="180"/>
+      </w:pPr>
+    </w:lvl>
+    <w:lvl w:ilvl="6" w:tplc="0809000F" w:tentative="1">
+      <w:start w:val="1"/>
+      <w:numFmt w:val="decimal"/>
+      <w:lvlText w:val="%7."/>
+      <w:lvlJc w:val="left"/>
+      <w:pPr>
+        <w:ind w:left="5040" w:hanging="360"/>
+      </w:pPr>
+    </w:lvl>
+    <w:lvl w:ilvl="7" w:tplc="08090019" w:tentative="1">
+      <w:start w:val="1"/>
+      <w:numFmt w:val="lowerLetter"/>
+      <w:lvlText w:val="%8."/>
+      <w:lvlJc w:val="left"/>
+      <w:pPr>
+        <w:ind w:left="5760" w:hanging="360"/>
+      </w:pPr>
+    </w:lvl>
+    <w:lvl w:ilvl="8" w:tplc="0809001B" w:tentative="1">
+      <w:start w:val="1"/>
+      <w:numFmt w:val="lowerRoman"/>
+      <w:lvlText w:val="%9."/>
+      <w:lvlJc w:val="right"/>
+      <w:pPr>
+        <w:ind w:left="6480" w:hanging="180"/>
+      </w:pPr>
+    </w:lvl>
+  </w:abstractNum>
+  <w:abstractNum w:abstractNumId="6" w15:restartNumberingAfterBreak="0">
     <w:nsid w:val="6CFA0A6B"/>
     <w:multiLevelType w:val="hybridMultilevel"/>
     <w:tmpl w:val="8BE2F0C0"/>
@@ -3469,8 +5046,118 @@
       </w:rPr>
     </w:lvl>
   </w:abstractNum>
+  <w:abstractNum w:abstractNumId="7" w15:restartNumberingAfterBreak="0">
+    <w:nsid w:val="724937FA"/>
+    <w:multiLevelType w:val="hybridMultilevel"/>
+    <w:tmpl w:val="A8B82818"/>
+    <w:lvl w:ilvl="0" w:tplc="1A62A940">
+      <w:start w:val="1"/>
+      <w:numFmt w:val="decimal"/>
+      <w:lvlText w:val="%1."/>
+      <w:lvlJc w:val="left"/>
+      <w:pPr>
+        <w:ind w:left="1080" w:hanging="360"/>
+      </w:pPr>
+      <w:rPr>
+        <w:rFonts w:hint="default"/>
+      </w:rPr>
+    </w:lvl>
+    <w:lvl w:ilvl="1" w:tplc="08090019" w:tentative="1">
+      <w:start w:val="1"/>
+      <w:numFmt w:val="lowerLetter"/>
+      <w:lvlText w:val="%2."/>
+      <w:lvlJc w:val="left"/>
+      <w:pPr>
+        <w:ind w:left="1800" w:hanging="360"/>
+      </w:pPr>
+    </w:lvl>
+    <w:lvl w:ilvl="2" w:tplc="0809001B" w:tentative="1">
+      <w:start w:val="1"/>
+      <w:numFmt w:val="lowerRoman"/>
+      <w:lvlText w:val="%3."/>
+      <w:lvlJc w:val="right"/>
+      <w:pPr>
+        <w:ind w:left="2520" w:hanging="180"/>
+      </w:pPr>
+    </w:lvl>
+    <w:lvl w:ilvl="3" w:tplc="0809000F" w:tentative="1">
+      <w:start w:val="1"/>
+      <w:numFmt w:val="decimal"/>
+      <w:lvlText w:val="%4."/>
+      <w:lvlJc w:val="left"/>
+      <w:pPr>
+        <w:ind w:left="3240" w:hanging="360"/>
+      </w:pPr>
+    </w:lvl>
+    <w:lvl w:ilvl="4" w:tplc="08090019" w:tentative="1">
+      <w:start w:val="1"/>
+      <w:numFmt w:val="lowerLetter"/>
+      <w:lvlText w:val="%5."/>
+      <w:lvlJc w:val="left"/>
+      <w:pPr>
+        <w:ind w:left="3960" w:hanging="360"/>
+      </w:pPr>
+    </w:lvl>
+    <w:lvl w:ilvl="5" w:tplc="0809001B" w:tentative="1">
+      <w:start w:val="1"/>
+      <w:numFmt w:val="lowerRoman"/>
+      <w:lvlText w:val="%6."/>
+      <w:lvlJc w:val="right"/>
+      <w:pPr>
+        <w:ind w:left="4680" w:hanging="180"/>
+      </w:pPr>
+    </w:lvl>
+    <w:lvl w:ilvl="6" w:tplc="0809000F" w:tentative="1">
+      <w:start w:val="1"/>
+      <w:numFmt w:val="decimal"/>
+      <w:lvlText w:val="%7."/>
+      <w:lvlJc w:val="left"/>
+      <w:pPr>
+        <w:ind w:left="5400" w:hanging="360"/>
+      </w:pPr>
+    </w:lvl>
+    <w:lvl w:ilvl="7" w:tplc="08090019" w:tentative="1">
+      <w:start w:val="1"/>
+      <w:numFmt w:val="lowerLetter"/>
+      <w:lvlText w:val="%8."/>
+      <w:lvlJc w:val="left"/>
+      <w:pPr>
+        <w:ind w:left="6120" w:hanging="360"/>
+      </w:pPr>
+    </w:lvl>
+    <w:lvl w:ilvl="8" w:tplc="0809001B" w:tentative="1">
+      <w:start w:val="1"/>
+      <w:numFmt w:val="lowerRoman"/>
+      <w:lvlText w:val="%9."/>
+      <w:lvlJc w:val="right"/>
+      <w:pPr>
+        <w:ind w:left="6840" w:hanging="180"/>
+      </w:pPr>
+    </w:lvl>
+  </w:abstractNum>
   <w:num w:numId="1" w16cid:durableId="1278416985">
+    <w:abstractNumId w:val="6"/>
+  </w:num>
+  <w:num w:numId="2" w16cid:durableId="732311216">
+    <w:abstractNumId w:val="3"/>
+  </w:num>
+  <w:num w:numId="3" w16cid:durableId="960916631">
+    <w:abstractNumId w:val="2"/>
+  </w:num>
+  <w:num w:numId="4" w16cid:durableId="278143875">
+    <w:abstractNumId w:val="7"/>
+  </w:num>
+  <w:num w:numId="5" w16cid:durableId="594674169">
+    <w:abstractNumId w:val="5"/>
+  </w:num>
+  <w:num w:numId="6" w16cid:durableId="1047100840">
     <w:abstractNumId w:val="0"/>
+  </w:num>
+  <w:num w:numId="7" w16cid:durableId="326833029">
+    <w:abstractNumId w:val="1"/>
+  </w:num>
+  <w:num w:numId="8" w16cid:durableId="1021278914">
+    <w:abstractNumId w:val="4"/>
   </w:num>
 </w:numbering>
 </file>
@@ -3903,7 +5590,6 @@
     <w:next w:val="Normal"/>
     <w:link w:val="Heading2Char"/>
     <w:uiPriority w:val="9"/>
-    <w:semiHidden/>
     <w:unhideWhenUsed/>
     <w:qFormat/>
     <w:rsid w:val="00A87A60"/>
@@ -4078,6 +5764,7 @@
   <w:style w:type="character" w:default="1" w:styleId="DefaultParagraphFont">
     <w:name w:val="Default Paragraph Font"/>
     <w:uiPriority w:val="1"/>
+    <w:semiHidden/>
     <w:unhideWhenUsed/>
   </w:style>
   <w:style w:type="table" w:default="1" w:styleId="TableNormal">
@@ -4119,7 +5806,6 @@
     <w:basedOn w:val="DefaultParagraphFont"/>
     <w:link w:val="Heading2"/>
     <w:uiPriority w:val="9"/>
-    <w:semiHidden/>
     <w:rsid w:val="00A87A60"/>
     <w:rPr>
       <w:rFonts w:asciiTheme="majorHAnsi" w:eastAsiaTheme="majorEastAsia" w:hAnsiTheme="majorHAnsi" w:cstheme="majorBidi"/>

</xml_diff>